<commit_message>
fix(esclerometria): corrigir marcadores de loop e condicional no template DOCX
</commit_message>
<xml_diff>
--- a/public/modelo_esclerometria.docx
+++ b/public/modelo_esclerometria.docx
@@ -86,7 +86,7 @@
             <wp:extent cx="7615555" cy="10772775"/>
             <wp:effectExtent l="0" t="0" r="4445" b="9525"/>
             <wp:wrapNone/>
-            <wp:docPr id="2" name="Imagem 2" descr="Uma imagem contendo Interface gráfica do usuário&#10;&#10;Descrição gerada automaticamente"/>
+            <wp:docPr id="2" name="Imagem 2" descr="Uma imagem contendo Interface gráfica do usuário  Descrição gerada automaticamente"/>
             <wp:cNvGraphicFramePr>
               <a:graphicFrameLocks xmlns:a="http://schemas.openxmlformats.org/drawingml/2006/main" noChangeAspect="1"/>
             </wp:cNvGraphicFramePr>
@@ -94,7 +94,7 @@
               <a:graphicData uri="http://schemas.openxmlformats.org/drawingml/2006/picture">
                 <pic:pic xmlns:pic="http://schemas.openxmlformats.org/drawingml/2006/picture">
                   <pic:nvPicPr>
-                    <pic:cNvPr id="2" name="Imagem 2" descr="Uma imagem contendo Interface gráfica do usuário&#10;&#10;Descrição gerada automaticamente"/>
+                    <pic:cNvPr id="2" name="Imagem 2" descr="Uma imagem contendo Interface gráfica do usuário  Descrição gerada automaticamente"/>
                     <pic:cNvPicPr/>
                   </pic:nvPicPr>
                   <pic:blipFill>
@@ -350,27 +350,7 @@
                 <w:sz w:val="48"/>
                 <w:szCs w:val="48"/>
               </w:rPr>
-              <w:t>–</w:t>
-            </w:r>
-            <w:r>
-              <w:rPr>
-                <w:rFonts w:asciiTheme="minorHAnsi" w:hAnsiTheme="minorHAnsi"/>
-                <w:b/>
-                <w:color w:val="0F243E" w:themeColor="text2" w:themeShade="80"/>
-                <w:sz w:val="48"/>
-                <w:szCs w:val="48"/>
-              </w:rPr>
-              <w:t>[[nome_ensaio]]</w:t>
-            </w:r>
-            <w:r>
-              <w:rPr>
-                <w:rFonts w:asciiTheme="minorHAnsi" w:hAnsiTheme="minorHAnsi"/>
-                <w:b/>
-                <w:color w:val="0F243E" w:themeColor="text2" w:themeShade="80"/>
-                <w:sz w:val="48"/>
-                <w:szCs w:val="48"/>
-              </w:rPr>
-              <w:t>–</w:t>
+              <w:t>–[[nome_ensaio]]–</w:t>
             </w:r>
           </w:p>
         </w:tc>
@@ -450,14 +430,7 @@
                 <w:rFonts w:asciiTheme="minorHAnsi" w:hAnsiTheme="minorHAnsi"/>
                 <w:color w:val="0F243E" w:themeColor="text2" w:themeShade="80"/>
               </w:rPr>
-              <w:t xml:space="preserve">CLIENTE: </w:t>
-            </w:r>
-            <w:r>
-              <w:rPr>
-                <w:rFonts w:asciiTheme="minorHAnsi" w:hAnsiTheme="minorHAnsi"/>
-                <w:color w:val="0F243E" w:themeColor="text2" w:themeShade="80"/>
-              </w:rPr>
-              <w:t>[[cliente]]</w:t>
+              <w:t>CLIENTE: [[cliente]]</w:t>
             </w:r>
           </w:p>
         </w:tc>
@@ -492,14 +465,7 @@
                 <w:rFonts w:asciiTheme="minorHAnsi" w:hAnsiTheme="minorHAnsi"/>
                 <w:color w:val="0F243E" w:themeColor="text2" w:themeShade="80"/>
               </w:rPr>
-              <w:t xml:space="preserve">OBRA: </w:t>
-            </w:r>
-            <w:r>
-              <w:rPr>
-                <w:rFonts w:asciiTheme="minorHAnsi" w:hAnsiTheme="minorHAnsi"/>
-                <w:color w:val="0F243E" w:themeColor="text2" w:themeShade="80"/>
-              </w:rPr>
-              <w:t>[[obra]]</w:t>
+              <w:t>OBRA: [[obra]]</w:t>
             </w:r>
           </w:p>
           <w:p>
@@ -515,14 +481,7 @@
                 <w:rFonts w:asciiTheme="minorHAnsi" w:hAnsiTheme="minorHAnsi"/>
                 <w:color w:val="0F243E" w:themeColor="text2" w:themeShade="80"/>
               </w:rPr>
-              <w:t xml:space="preserve">ATT.: </w:t>
-            </w:r>
-            <w:r>
-              <w:rPr>
-                <w:rFonts w:asciiTheme="minorHAnsi" w:hAnsiTheme="minorHAnsi"/>
-                <w:color w:val="0F243E" w:themeColor="text2" w:themeShade="80"/>
-              </w:rPr>
-              <w:t>[[att]]</w:t>
+              <w:t>ATT.: [[att]]</w:t>
             </w:r>
           </w:p>
         </w:tc>
@@ -651,19 +610,7 @@
         <w:rPr>
           <w:rFonts w:asciiTheme="minorHAnsi" w:hAnsiTheme="minorHAnsi" w:cstheme="minorHAnsi"/>
         </w:rPr>
-        <w:t xml:space="preserve">NBR 7584:2012 - </w:t>
-      </w:r>
-      <w:r>
-        <w:rPr>
-          <w:rFonts w:asciiTheme="minorHAnsi" w:hAnsiTheme="minorHAnsi" w:cstheme="minorHAnsi"/>
-        </w:rPr>
-        <w:t>concreto endurecido - avaliação da dureza superficial pelo esclerômetro de reflexão - método de ensaio</w:t>
-      </w:r>
-      <w:r>
-        <w:rPr>
-          <w:rFonts w:asciiTheme="minorHAnsi" w:hAnsiTheme="minorHAnsi" w:cstheme="minorHAnsi"/>
-        </w:rPr>
-        <w:t>.</w:t>
+        <w:t>NBR 7584:2012 - concreto endurecido - avaliação da dureza superficial pelo esclerômetro de reflexão - método de ensaio.</w:t>
       </w:r>
     </w:p>
     <w:p>
@@ -731,15 +678,15 @@
       <w:tblGrid>
         <w:gridCol w:w="903"/>
         <w:gridCol w:w="858"/>
-        <w:gridCol w:w="1169"/>
-        <w:gridCol w:w="880"/>
-        <w:gridCol w:w="880"/>
-        <w:gridCol w:w="878"/>
-        <w:gridCol w:w="878"/>
-        <w:gridCol w:w="878"/>
-        <w:gridCol w:w="878"/>
+        <w:gridCol w:w="1167"/>
+        <w:gridCol w:w="881"/>
+        <w:gridCol w:w="881"/>
         <w:gridCol w:w="879"/>
-        <w:gridCol w:w="973"/>
+        <w:gridCol w:w="879"/>
+        <w:gridCol w:w="879"/>
+        <w:gridCol w:w="879"/>
+        <w:gridCol w:w="879"/>
+        <w:gridCol w:w="969"/>
       </w:tblGrid>
       <w:tr>
         <w:trPr>
@@ -1279,15 +1226,7 @@
                 <w:b/>
                 <w:bCs/>
               </w:rPr>
-              <w:t>MÉDIA</w:t>
-            </w:r>
-            <w:r>
-              <w:rPr>
-                <w:rFonts w:asciiTheme="minorHAnsi" w:hAnsiTheme="minorHAnsi" w:cstheme="minorHAnsi"/>
-                <w:b/>
-                <w:bCs/>
-              </w:rPr>
-              <w:t>:</w:t>
+              <w:t>MÉDIA:</w:t>
             </w:r>
           </w:p>
         </w:tc>
@@ -1540,12 +1479,12 @@
         <w:tblLook w:val="04A0" w:firstRow="1" w:lastRow="0" w:firstColumn="1" w:lastColumn="0" w:noHBand="0" w:noVBand="1"/>
       </w:tblPr>
       <w:tblGrid>
-        <w:gridCol w:w="2544"/>
+        <w:gridCol w:w="2521"/>
         <w:gridCol w:w="1564"/>
-        <w:gridCol w:w="1431"/>
-        <w:gridCol w:w="1495"/>
-        <w:gridCol w:w="1562"/>
-        <w:gridCol w:w="1458"/>
+        <w:gridCol w:w="1424"/>
+        <w:gridCol w:w="1487"/>
+        <w:gridCol w:w="1554"/>
+        <w:gridCol w:w="1504"/>
       </w:tblGrid>
       <w:tr>
         <w:trPr>
@@ -1799,7 +1738,7 @@
                 <w:rFonts w:asciiTheme="minorHAnsi" w:hAnsiTheme="minorHAnsi" w:cstheme="minorHAnsi"/>
                 <w:lang w:eastAsia="pt-BR"/>
               </w:rPr>
-              <w:t>[#amostras] [[amostra]]</w:t>
+              <w:t>[[#amostras]] [[amostra]]</w:t>
             </w:r>
           </w:p>
         </w:tc>
@@ -1909,7 +1848,7 @@
                 <w:rFonts w:asciiTheme="minorHAnsi" w:hAnsiTheme="minorHAnsi" w:cstheme="minorHAnsi"/>
                 <w:lang w:eastAsia="pt-BR"/>
               </w:rPr>
-              <w:t>[[dispersao]] [/amostras]</w:t>
+              <w:t>[[dispersao]] [[/amostras]]</w:t>
             </w:r>
           </w:p>
         </w:tc>
@@ -1935,7 +1874,7 @@
           <w:rFonts w:asciiTheme="minorHAnsi" w:hAnsiTheme="minorHAnsi" w:cstheme="minorHAnsi"/>
           <w:lang w:eastAsia="pt-BR"/>
         </w:rPr>
-        <w:t>[#notas]</w:t>
+        <w:t>[[#notas]]</w:t>
       </w:r>
     </w:p>
     <w:p>
@@ -1985,7 +1924,7 @@
           <w:rFonts w:asciiTheme="minorHAnsi" w:hAnsiTheme="minorHAnsi" w:cstheme="minorHAnsi"/>
           <w:lang w:eastAsia="pt-BR"/>
         </w:rPr>
-        <w:t>[/notas]</w:t>
+        <w:t>[[/notas]]</w:t>
       </w:r>
     </w:p>
     <w:p>
@@ -1993,16 +1932,6 @@
         <w:rPr>
           <w:rFonts w:asciiTheme="minorHAnsi" w:hAnsiTheme="minorHAnsi" w:cstheme="minorHAnsi"/>
           <w:lang w:eastAsia="pt-BR"/>
-        </w:rPr>
-      </w:pPr>
-    </w:p>
-    <w:p>
-      <w:pPr>
-        <w:keepLines/>
-        <w:spacing w:before="120" w:after="120" w:line="360" w:lineRule="auto"/>
-        <w:jc w:val="both"/>
-        <w:rPr>
-          <w:rFonts w:asciiTheme="minorHAnsi" w:hAnsiTheme="minorHAnsi"/>
         </w:rPr>
       </w:pPr>
       <w:r>
@@ -2011,18 +1940,18 @@
           <w:lang w:eastAsia="pt-BR"/>
         </w:rPr>
         <w:drawing>
-          <wp:anchor distT="0" distB="0" distL="114300" distR="114300" simplePos="0" relativeHeight="251761664" behindDoc="1" locked="0" layoutInCell="1" allowOverlap="1" wp14:anchorId="52E0F9B5" wp14:editId="067710EC">
+          <wp:anchor distT="0" distB="0" distL="114300" distR="114300" simplePos="0" relativeHeight="251761664" behindDoc="1" locked="0" layoutInCell="1" allowOverlap="1" wp14:anchorId="0A969291" wp14:editId="314F9AA5">
             <wp:simplePos x="0" y="0"/>
             <wp:positionH relativeFrom="column">
-              <wp:posOffset>742950</wp:posOffset>
+              <wp:posOffset>838200</wp:posOffset>
             </wp:positionH>
             <wp:positionV relativeFrom="paragraph">
-              <wp:posOffset>249555</wp:posOffset>
+              <wp:posOffset>17780</wp:posOffset>
             </wp:positionV>
             <wp:extent cx="1362075" cy="619125"/>
             <wp:effectExtent l="19050" t="0" r="9525" b="0"/>
             <wp:wrapNone/>
-            <wp:docPr id="612" name="Imagem 612" descr="Desenho com traços pretos em fundo branco&#10;&#10;O conteúdo gerado por IA pode estar incorreto."/>
+            <wp:docPr id="612" name="Imagem 612" descr="Desenho com traços pretos em fundo branco  O conteúdo gerado por IA pode estar incorreto."/>
             <wp:cNvGraphicFramePr>
               <a:graphicFrameLocks xmlns:a="http://schemas.openxmlformats.org/drawingml/2006/main" noChangeAspect="1"/>
             </wp:cNvGraphicFramePr>
@@ -2030,7 +1959,7 @@
               <a:graphicData uri="http://schemas.openxmlformats.org/drawingml/2006/picture">
                 <pic:pic xmlns:pic="http://schemas.openxmlformats.org/drawingml/2006/picture">
                   <pic:nvPicPr>
-                    <pic:cNvPr id="612" name="Imagem 612" descr="Desenho com traços pretos em fundo branco&#10;&#10;O conteúdo gerado por IA pode estar incorreto."/>
+                    <pic:cNvPr id="612" name="Imagem 612" descr="Desenho com traços pretos em fundo branco  O conteúdo gerado por IA pode estar incorreto."/>
                     <pic:cNvPicPr>
                       <a:picLocks noChangeAspect="1" noChangeArrowheads="1"/>
                     </pic:cNvPicPr>
@@ -2064,45 +1993,34 @@
                 </pic:pic>
               </a:graphicData>
             </a:graphic>
+            <wp14:sizeRelH relativeFrom="margin">
+              <wp14:pctWidth>0</wp14:pctWidth>
+            </wp14:sizeRelH>
+            <wp14:sizeRelV relativeFrom="margin">
+              <wp14:pctHeight>0</wp14:pctHeight>
+            </wp14:sizeRelV>
           </wp:anchor>
         </w:drawing>
       </w:r>
     </w:p>
     <w:p>
       <w:pPr>
-        <w:pStyle w:val="PargrafodaLista"/>
-        <w:keepLines/>
-        <w:spacing w:before="120" w:after="120" w:line="360" w:lineRule="auto"/>
-        <w:ind w:left="357"/>
-        <w:jc w:val="both"/>
         <w:rPr>
-          <w:rFonts w:asciiTheme="minorHAnsi" w:hAnsiTheme="minorHAnsi"/>
+          <w:rFonts w:asciiTheme="minorHAnsi" w:hAnsiTheme="minorHAnsi" w:cstheme="minorHAnsi"/>
+          <w:lang w:eastAsia="pt-BR"/>
         </w:rPr>
-      </w:pPr>
-    </w:p>
-    <w:p>
-      <w:pPr>
-        <w:keepLines/>
       </w:pPr>
     </w:p>
     <w:tbl>
       <w:tblPr>
         <w:tblStyle w:val="Tabelacomgrade"/>
-        <w:tblW w:w="10314" w:type="dxa"/>
+        <w:tblW w:w="0" w:type="auto"/>
         <w:jc w:val="center"/>
-        <w:tblBorders>
-          <w:top w:val="none" w:sz="0" w:space="0" w:color="auto"/>
-          <w:left w:val="none" w:sz="0" w:space="0" w:color="auto"/>
-          <w:bottom w:val="none" w:sz="0" w:space="0" w:color="auto"/>
-          <w:right w:val="none" w:sz="0" w:space="0" w:color="auto"/>
-          <w:insideV w:val="none" w:sz="0" w:space="0" w:color="auto"/>
-        </w:tblBorders>
         <w:tblLook w:val="04A0" w:firstRow="1" w:lastRow="0" w:firstColumn="1" w:lastColumn="0" w:noHBand="0" w:noVBand="1"/>
       </w:tblPr>
       <w:tblGrid>
-        <w:gridCol w:w="4786"/>
-        <w:gridCol w:w="567"/>
-        <w:gridCol w:w="4961"/>
+        <w:gridCol w:w="5027"/>
+        <w:gridCol w:w="5027"/>
       </w:tblGrid>
       <w:tr>
         <w:trPr>
@@ -2110,169 +2028,99 @@
         </w:trPr>
         <w:tc>
           <w:tcPr>
-            <w:tcW w:w="4786" w:type="dxa"/>
-            <w:tcBorders>
-              <w:top w:val="single" w:sz="4" w:space="0" w:color="auto"/>
-              <w:bottom w:val="nil"/>
-            </w:tcBorders>
+            <w:tcW w:w="5027" w:type="dxa"/>
+            <w:vAlign w:val="center"/>
           </w:tcPr>
           <w:p>
             <w:pPr>
               <w:keepLines/>
               <w:jc w:val="center"/>
               <w:rPr>
+                <w:rFonts w:asciiTheme="minorHAnsi" w:hAnsiTheme="minorHAnsi" w:cstheme="minorHAnsi"/>
+                <w:lang w:eastAsia="pt-BR"/>
+              </w:rPr>
+            </w:pPr>
+            <w:r>
+              <w:rPr>
                 <w:rFonts w:ascii="Calibri" w:hAnsi="Calibri"/>
                 <w:b/>
                 <w:i/>
               </w:rPr>
-            </w:pPr>
+              <w:t>João Ribeiro de Carvalho</w:t>
+            </w:r>
             <w:r>
               <w:rPr>
                 <w:rFonts w:ascii="Calibri" w:hAnsi="Calibri"/>
                 <w:b/>
                 <w:i/>
               </w:rPr>
-              <w:t>João Ribeiro de Carvalho</w:t>
+              <w:br/>
             </w:r>
-          </w:p>
-          <w:p>
-            <w:pPr>
-              <w:keepLines/>
-              <w:jc w:val="center"/>
-              <w:rPr>
-                <w:rFonts w:ascii="Calibri" w:hAnsi="Calibri"/>
-              </w:rPr>
-            </w:pPr>
             <w:r>
               <w:rPr>
-                <w:rFonts w:ascii="Calibri" w:hAnsi="Calibri"/>
+                <w:rFonts w:asciiTheme="minorHAnsi" w:hAnsiTheme="minorHAnsi" w:cstheme="minorHAnsi"/>
               </w:rPr>
               <w:t>Engenheiro Civil</w:t>
             </w:r>
-          </w:p>
-          <w:p>
-            <w:pPr>
-              <w:pStyle w:val="Recuodecorpodetexto"/>
-              <w:keepLines/>
-              <w:spacing w:line="240" w:lineRule="auto"/>
-              <w:ind w:firstLine="0"/>
-              <w:jc w:val="center"/>
-              <w:rPr>
-                <w:rFonts w:ascii="Calibri" w:hAnsi="Calibri"/>
-                <w:sz w:val="20"/>
-              </w:rPr>
-            </w:pPr>
             <w:r>
               <w:rPr>
-                <w:rFonts w:ascii="Calibri" w:hAnsi="Calibri"/>
-              </w:rPr>
-              <w:t xml:space="preserve">CREA nº </w:t>
-            </w:r>
-            <w:r>
-              <w:rPr>
-                <w:rFonts w:ascii="Calibri" w:hAnsi="Calibri"/>
-              </w:rPr>
-              <w:t>49780</w:t>
-            </w:r>
-            <w:r>
-              <w:rPr>
-                <w:rFonts w:ascii="Calibri" w:hAnsi="Calibri"/>
-              </w:rPr>
-              <w:t xml:space="preserve"> – PE</w:t>
+                <w:rFonts w:asciiTheme="minorHAnsi" w:hAnsiTheme="minorHAnsi" w:cstheme="minorHAnsi"/>
+              </w:rPr>
+              <w:br/>
+              <w:t>CREA Nº49780 – PE</w:t>
             </w:r>
           </w:p>
         </w:tc>
         <w:tc>
           <w:tcPr>
-            <w:tcW w:w="567" w:type="dxa"/>
+            <w:tcW w:w="5027" w:type="dxa"/>
+            <w:vAlign w:val="center"/>
           </w:tcPr>
           <w:p>
             <w:pPr>
-              <w:pStyle w:val="Recuodecorpodetexto"/>
-              <w:keepLines/>
-              <w:spacing w:line="240" w:lineRule="auto"/>
-              <w:ind w:firstLine="0"/>
+              <w:jc w:val="center"/>
               <w:rPr>
                 <w:rFonts w:ascii="Calibri" w:hAnsi="Calibri"/>
                 <w:b/>
+                <w:bCs/>
                 <w:i/>
-              </w:rPr>
-            </w:pPr>
-          </w:p>
-        </w:tc>
-        <w:tc>
-          <w:tcPr>
-            <w:tcW w:w="4961" w:type="dxa"/>
-            <w:tcBorders>
-              <w:top w:val="single" w:sz="4" w:space="0" w:color="auto"/>
-              <w:bottom w:val="nil"/>
-            </w:tcBorders>
-          </w:tcPr>
-          <w:p>
-            <w:pPr>
-              <w:pStyle w:val="Recuodecorpodetexto"/>
-              <w:keepLines/>
-              <w:spacing w:line="240" w:lineRule="auto"/>
-              <w:jc w:val="center"/>
-              <w:rPr>
-                <w:rFonts w:ascii="Calibri" w:hAnsi="Calibri"/>
-                <w:sz w:val="20"/>
+                <w:iCs/>
+                <w:szCs w:val="24"/>
               </w:rPr>
             </w:pPr>
             <w:r>
               <w:rPr>
                 <w:rFonts w:ascii="Calibri" w:hAnsi="Calibri"/>
-                <w:sz w:val="20"/>
+                <w:b/>
+                <w:bCs/>
+                <w:i/>
+                <w:iCs/>
+                <w:szCs w:val="24"/>
               </w:rPr>
               <w:t>[[resp_nome]]</w:t>
             </w:r>
           </w:p>
           <w:p>
             <w:pPr>
-              <w:pStyle w:val="Recuodecorpodetexto"/>
-              <w:keepLines/>
-              <w:spacing w:line="240" w:lineRule="auto"/>
-              <w:ind w:firstLine="0"/>
               <w:jc w:val="center"/>
               <w:rPr>
-                <w:rFonts w:ascii="Calibri" w:hAnsi="Calibri"/>
+                <w:rFonts w:asciiTheme="minorHAnsi" w:hAnsiTheme="minorHAnsi" w:cstheme="minorHAnsi"/>
+                <w:lang w:eastAsia="pt-BR"/>
               </w:rPr>
             </w:pPr>
             <w:r>
               <w:rPr>
-                <w:rFonts w:ascii="Calibri" w:hAnsi="Calibri"/>
+                <w:rFonts w:asciiTheme="minorHAnsi" w:hAnsiTheme="minorHAnsi" w:cstheme="minorHAnsi"/>
               </w:rPr>
               <w:t>Engenheiro Civil</w:t>
             </w:r>
-          </w:p>
-          <w:p>
-            <w:pPr>
-              <w:pStyle w:val="Recuodecorpodetexto"/>
-              <w:keepLines/>
-              <w:spacing w:line="240" w:lineRule="auto"/>
-              <w:ind w:firstLine="0"/>
-              <w:jc w:val="center"/>
-              <w:rPr>
-                <w:rFonts w:ascii="Calibri" w:hAnsi="Calibri"/>
-              </w:rPr>
-            </w:pPr>
             <w:r>
               <w:rPr>
-                <w:rFonts w:ascii="Calibri" w:hAnsi="Calibri"/>
-              </w:rPr>
-              <w:t xml:space="preserve">CREA nº </w:t>
+                <w:rFonts w:asciiTheme="minorHAnsi" w:hAnsiTheme="minorHAnsi" w:cstheme="minorHAnsi"/>
+              </w:rPr>
+              <w:br/>
+              <w:t>CREA Nº [[resp_crea]]</w:t>
             </w:r>
-            <w:r>
-              <w:rPr>
-                <w:rFonts w:ascii="Calibri" w:hAnsi="Calibri"/>
-              </w:rPr>
-              <w:t>[[resp_crea]]</w:t>
-            </w:r>
-          </w:p>
-          <w:p>
-            <w:pPr>
-              <w:keepLines/>
-            </w:pPr>
           </w:p>
         </w:tc>
       </w:tr>
@@ -2462,7 +2310,7 @@
         <wp:inline distT="0" distB="0" distL="0" distR="0" wp14:anchorId="7AA1EED0" wp14:editId="68594385">
           <wp:extent cx="1914525" cy="531697"/>
           <wp:effectExtent l="0" t="0" r="0" b="1905"/>
-          <wp:docPr id="909002630" name="Imagem 909002630" descr="Logotipo&#10;&#10;O conteúdo gerado por IA pode estar incorreto."/>
+          <wp:docPr id="156397638" name="Imagem 156397638" descr="Logotipo  O conteúdo gerado por IA pode estar incorreto."/>
           <wp:cNvGraphicFramePr>
             <a:graphicFrameLocks xmlns:a="http://schemas.openxmlformats.org/drawingml/2006/main" noChangeAspect="1"/>
           </wp:cNvGraphicFramePr>
@@ -2470,7 +2318,7 @@
             <a:graphicData uri="http://schemas.openxmlformats.org/drawingml/2006/picture">
               <pic:pic xmlns:pic="http://schemas.openxmlformats.org/drawingml/2006/picture">
                 <pic:nvPicPr>
-                  <pic:cNvPr id="909002630" name="Imagem 909002630" descr="Logotipo&#10;&#10;O conteúdo gerado por IA pode estar incorreto."/>
+                  <pic:cNvPr id="909002630" name="Imagem 909002630" descr="Logotipo  O conteúdo gerado por IA pode estar incorreto."/>
                   <pic:cNvPicPr/>
                 </pic:nvPicPr>
                 <pic:blipFill>

</xml_diff>

<commit_message>
fix: corrigir marcador [[endereco]] no template DOCX
</commit_message>
<xml_diff>
--- a/public/modelo_esclerometria.docx
+++ b/public/modelo_esclerometria.docx
@@ -473,7 +473,6 @@
               <w:rPr>
                 <w:rFonts w:asciiTheme="minorHAnsi" w:hAnsiTheme="minorHAnsi"/>
                 <w:color w:val="0F243E" w:themeColor="text2" w:themeShade="80"/>
-                <w:highlight w:val="yellow"/>
               </w:rPr>
             </w:pPr>
             <w:r>
@@ -482,6 +481,29 @@
                 <w:color w:val="0F243E" w:themeColor="text2" w:themeShade="80"/>
               </w:rPr>
               <w:t>ATT.: [[att]]</w:t>
+            </w:r>
+          </w:p>
+          <w:p>
+            <w:pPr>
+              <w:rPr>
+                <w:rFonts w:asciiTheme="minorHAnsi" w:hAnsiTheme="minorHAnsi"/>
+                <w:color w:val="0F243E" w:themeColor="text2" w:themeShade="80"/>
+                <w:highlight w:val="yellow"/>
+              </w:rPr>
+            </w:pPr>
+            <w:r>
+              <w:rPr>
+                <w:rFonts w:asciiTheme="minorHAnsi" w:hAnsiTheme="minorHAnsi"/>
+                <w:color w:val="0F243E" w:themeColor="text2" w:themeShade="80"/>
+              </w:rPr>
+              <w:t xml:space="preserve">ENDEREÇO: </w:t>
+            </w:r>
+            <w:r>
+              <w:rPr>
+                <w:rFonts w:asciiTheme="minorHAnsi" w:hAnsiTheme="minorHAnsi"/>
+                <w:color w:val="0F243E" w:themeColor="text2" w:themeShade="80"/>
+              </w:rPr>
+              <w:t>[[endereco]]</w:t>
             </w:r>
           </w:p>
         </w:tc>
@@ -2016,6 +2038,14 @@
         <w:tblStyle w:val="Tabelacomgrade"/>
         <w:tblW w:w="0" w:type="auto"/>
         <w:jc w:val="center"/>
+        <w:tblBorders>
+          <w:top w:val="none" w:sz="0" w:space="0" w:color="auto"/>
+          <w:left w:val="none" w:sz="0" w:space="0" w:color="auto"/>
+          <w:bottom w:val="none" w:sz="0" w:space="0" w:color="auto"/>
+          <w:right w:val="none" w:sz="0" w:space="0" w:color="auto"/>
+          <w:insideH w:val="none" w:sz="0" w:space="0" w:color="auto"/>
+          <w:insideV w:val="none" w:sz="0" w:space="0" w:color="auto"/>
+        </w:tblBorders>
         <w:tblLook w:val="04A0" w:firstRow="1" w:lastRow="0" w:firstColumn="1" w:lastColumn="0" w:noHBand="0" w:noVBand="1"/>
       </w:tblPr>
       <w:tblGrid>
@@ -2129,6 +2159,9 @@
       <w:pPr>
         <w:rPr>
           <w:rFonts w:asciiTheme="minorHAnsi" w:hAnsiTheme="minorHAnsi" w:cstheme="minorHAnsi"/>
+          <w:color w:val="FFFFFF" w:themeColor="background1"/>
+          <w:sz w:val="2"/>
+          <w:szCs w:val="2"/>
           <w:lang w:eastAsia="pt-BR"/>
         </w:rPr>
       </w:pPr>
@@ -7732,7 +7765,6 @@
   <w:style w:type="character" w:default="1" w:styleId="Fontepargpadro">
     <w:name w:val="Default Paragraph Font"/>
     <w:uiPriority w:val="1"/>
-    <w:semiHidden/>
     <w:unhideWhenUsed/>
   </w:style>
   <w:style w:type="table" w:default="1" w:styleId="Tabelanormal">

</xml_diff>

<commit_message>
fix: add endereco field to DOCX payload and fix signature page break
</commit_message>
<xml_diff>
--- a/public/modelo_esclerometria.docx
+++ b/public/modelo_esclerometria.docx
@@ -693,22 +693,26 @@
     <w:tbl>
       <w:tblPr>
         <w:tblStyle w:val="Tabelacomgrade"/>
-        <w:tblW w:w="5000" w:type="pct"/>
+        <w:tblW w:w="0" w:type="auto"/>
         <w:jc w:val="center"/>
+        <w:tblLayout w:type="fixed"/>
         <w:tblLook w:val="04A0" w:firstRow="1" w:lastRow="0" w:firstColumn="1" w:lastColumn="0" w:noHBand="0" w:noVBand="1"/>
       </w:tblPr>
       <w:tblGrid>
-        <w:gridCol w:w="903"/>
-        <w:gridCol w:w="858"/>
-        <w:gridCol w:w="1167"/>
-        <w:gridCol w:w="881"/>
-        <w:gridCol w:w="881"/>
-        <w:gridCol w:w="879"/>
-        <w:gridCol w:w="879"/>
-        <w:gridCol w:w="879"/>
-        <w:gridCol w:w="879"/>
-        <w:gridCol w:w="879"/>
-        <w:gridCol w:w="969"/>
+        <w:gridCol w:w="889"/>
+        <w:gridCol w:w="773"/>
+        <w:gridCol w:w="117"/>
+        <w:gridCol w:w="889"/>
+        <w:gridCol w:w="144"/>
+        <w:gridCol w:w="746"/>
+        <w:gridCol w:w="890"/>
+        <w:gridCol w:w="889"/>
+        <w:gridCol w:w="890"/>
+        <w:gridCol w:w="890"/>
+        <w:gridCol w:w="889"/>
+        <w:gridCol w:w="826"/>
+        <w:gridCol w:w="64"/>
+        <w:gridCol w:w="890"/>
       </w:tblGrid>
       <w:tr>
         <w:trPr>
@@ -716,7 +720,7 @@
         </w:trPr>
         <w:tc>
           <w:tcPr>
-            <w:tcW w:w="449" w:type="pct"/>
+            <w:tcW w:w="889" w:type="dxa"/>
             <w:vAlign w:val="center"/>
           </w:tcPr>
           <w:p>
@@ -727,6 +731,8 @@
                 <w:rFonts w:asciiTheme="minorHAnsi" w:hAnsiTheme="minorHAnsi" w:cstheme="minorHAnsi"/>
                 <w:b/>
                 <w:bCs/>
+                <w:sz w:val="22"/>
+                <w:szCs w:val="18"/>
               </w:rPr>
             </w:pPr>
             <w:r>
@@ -734,6 +740,8 @@
                 <w:rFonts w:asciiTheme="minorHAnsi" w:hAnsiTheme="minorHAnsi" w:cstheme="minorHAnsi"/>
                 <w:b/>
                 <w:bCs/>
+                <w:sz w:val="22"/>
+                <w:szCs w:val="18"/>
               </w:rPr>
               <w:t>GOLPE</w:t>
             </w:r>
@@ -741,7 +749,8 @@
         </w:tc>
         <w:tc>
           <w:tcPr>
-            <w:tcW w:w="427" w:type="pct"/>
+            <w:tcW w:w="890" w:type="dxa"/>
+            <w:gridSpan w:val="2"/>
           </w:tcPr>
           <w:p>
             <w:pPr>
@@ -751,6 +760,8 @@
                 <w:rFonts w:asciiTheme="minorHAnsi" w:hAnsiTheme="minorHAnsi" w:cstheme="minorHAnsi"/>
                 <w:b/>
                 <w:bCs/>
+                <w:sz w:val="22"/>
+                <w:szCs w:val="18"/>
               </w:rPr>
             </w:pPr>
             <w:r>
@@ -758,6 +769,8 @@
                 <w:rFonts w:asciiTheme="minorHAnsi" w:hAnsiTheme="minorHAnsi" w:cstheme="minorHAnsi"/>
                 <w:b/>
                 <w:bCs/>
+                <w:sz w:val="22"/>
+                <w:szCs w:val="18"/>
               </w:rPr>
               <w:t>1º</w:t>
             </w:r>
@@ -765,7 +778,7 @@
         </w:tc>
         <w:tc>
           <w:tcPr>
-            <w:tcW w:w="581" w:type="pct"/>
+            <w:tcW w:w="889" w:type="dxa"/>
           </w:tcPr>
           <w:p>
             <w:pPr>
@@ -775,6 +788,8 @@
                 <w:rFonts w:asciiTheme="minorHAnsi" w:hAnsiTheme="minorHAnsi" w:cstheme="minorHAnsi"/>
                 <w:b/>
                 <w:bCs/>
+                <w:sz w:val="22"/>
+                <w:szCs w:val="18"/>
               </w:rPr>
             </w:pPr>
             <w:r>
@@ -782,6 +797,8 @@
                 <w:rFonts w:asciiTheme="minorHAnsi" w:hAnsiTheme="minorHAnsi" w:cstheme="minorHAnsi"/>
                 <w:b/>
                 <w:bCs/>
+                <w:sz w:val="22"/>
+                <w:szCs w:val="18"/>
               </w:rPr>
               <w:t>2º</w:t>
             </w:r>
@@ -789,7 +806,8 @@
         </w:tc>
         <w:tc>
           <w:tcPr>
-            <w:tcW w:w="438" w:type="pct"/>
+            <w:tcW w:w="890" w:type="dxa"/>
+            <w:gridSpan w:val="2"/>
           </w:tcPr>
           <w:p>
             <w:pPr>
@@ -799,6 +817,8 @@
                 <w:rFonts w:asciiTheme="minorHAnsi" w:hAnsiTheme="minorHAnsi" w:cstheme="minorHAnsi"/>
                 <w:b/>
                 <w:bCs/>
+                <w:sz w:val="22"/>
+                <w:szCs w:val="18"/>
               </w:rPr>
             </w:pPr>
             <w:r>
@@ -806,6 +826,8 @@
                 <w:rFonts w:asciiTheme="minorHAnsi" w:hAnsiTheme="minorHAnsi" w:cstheme="minorHAnsi"/>
                 <w:b/>
                 <w:bCs/>
+                <w:sz w:val="22"/>
+                <w:szCs w:val="18"/>
               </w:rPr>
               <w:t>3º</w:t>
             </w:r>
@@ -813,7 +835,7 @@
         </w:tc>
         <w:tc>
           <w:tcPr>
-            <w:tcW w:w="438" w:type="pct"/>
+            <w:tcW w:w="890" w:type="dxa"/>
           </w:tcPr>
           <w:p>
             <w:pPr>
@@ -823,6 +845,8 @@
                 <w:rFonts w:asciiTheme="minorHAnsi" w:hAnsiTheme="minorHAnsi" w:cstheme="minorHAnsi"/>
                 <w:b/>
                 <w:bCs/>
+                <w:sz w:val="22"/>
+                <w:szCs w:val="18"/>
               </w:rPr>
             </w:pPr>
             <w:r>
@@ -830,6 +854,8 @@
                 <w:rFonts w:asciiTheme="minorHAnsi" w:hAnsiTheme="minorHAnsi" w:cstheme="minorHAnsi"/>
                 <w:b/>
                 <w:bCs/>
+                <w:sz w:val="22"/>
+                <w:szCs w:val="18"/>
               </w:rPr>
               <w:t>4º</w:t>
             </w:r>
@@ -837,7 +863,7 @@
         </w:tc>
         <w:tc>
           <w:tcPr>
-            <w:tcW w:w="437" w:type="pct"/>
+            <w:tcW w:w="889" w:type="dxa"/>
             <w:vAlign w:val="center"/>
           </w:tcPr>
           <w:p>
@@ -848,6 +874,8 @@
                 <w:rFonts w:asciiTheme="minorHAnsi" w:hAnsiTheme="minorHAnsi" w:cstheme="minorHAnsi"/>
                 <w:b/>
                 <w:bCs/>
+                <w:sz w:val="22"/>
+                <w:szCs w:val="18"/>
               </w:rPr>
             </w:pPr>
             <w:r>
@@ -855,6 +883,8 @@
                 <w:rFonts w:asciiTheme="minorHAnsi" w:hAnsiTheme="minorHAnsi" w:cstheme="minorHAnsi"/>
                 <w:b/>
                 <w:bCs/>
+                <w:sz w:val="22"/>
+                <w:szCs w:val="18"/>
               </w:rPr>
               <w:t>5º</w:t>
             </w:r>
@@ -862,7 +892,7 @@
         </w:tc>
         <w:tc>
           <w:tcPr>
-            <w:tcW w:w="437" w:type="pct"/>
+            <w:tcW w:w="890" w:type="dxa"/>
             <w:vAlign w:val="center"/>
           </w:tcPr>
           <w:p>
@@ -873,6 +903,8 @@
                 <w:rFonts w:asciiTheme="minorHAnsi" w:hAnsiTheme="minorHAnsi" w:cstheme="minorHAnsi"/>
                 <w:b/>
                 <w:bCs/>
+                <w:sz w:val="22"/>
+                <w:szCs w:val="18"/>
               </w:rPr>
             </w:pPr>
             <w:r>
@@ -880,6 +912,8 @@
                 <w:rFonts w:asciiTheme="minorHAnsi" w:hAnsiTheme="minorHAnsi" w:cstheme="minorHAnsi"/>
                 <w:b/>
                 <w:bCs/>
+                <w:sz w:val="22"/>
+                <w:szCs w:val="18"/>
               </w:rPr>
               <w:t>6º</w:t>
             </w:r>
@@ -887,7 +921,7 @@
         </w:tc>
         <w:tc>
           <w:tcPr>
-            <w:tcW w:w="437" w:type="pct"/>
+            <w:tcW w:w="890" w:type="dxa"/>
             <w:vAlign w:val="center"/>
           </w:tcPr>
           <w:p>
@@ -898,6 +932,8 @@
                 <w:rFonts w:asciiTheme="minorHAnsi" w:hAnsiTheme="minorHAnsi" w:cstheme="minorHAnsi"/>
                 <w:b/>
                 <w:bCs/>
+                <w:sz w:val="22"/>
+                <w:szCs w:val="18"/>
               </w:rPr>
             </w:pPr>
             <w:r>
@@ -905,6 +941,8 @@
                 <w:rFonts w:asciiTheme="minorHAnsi" w:hAnsiTheme="minorHAnsi" w:cstheme="minorHAnsi"/>
                 <w:b/>
                 <w:bCs/>
+                <w:sz w:val="22"/>
+                <w:szCs w:val="18"/>
               </w:rPr>
               <w:t>7º</w:t>
             </w:r>
@@ -912,7 +950,7 @@
         </w:tc>
         <w:tc>
           <w:tcPr>
-            <w:tcW w:w="437" w:type="pct"/>
+            <w:tcW w:w="889" w:type="dxa"/>
             <w:vAlign w:val="center"/>
           </w:tcPr>
           <w:p>
@@ -923,6 +961,8 @@
                 <w:rFonts w:asciiTheme="minorHAnsi" w:hAnsiTheme="minorHAnsi" w:cstheme="minorHAnsi"/>
                 <w:b/>
                 <w:bCs/>
+                <w:sz w:val="22"/>
+                <w:szCs w:val="18"/>
               </w:rPr>
             </w:pPr>
             <w:r>
@@ -930,6 +970,8 @@
                 <w:rFonts w:asciiTheme="minorHAnsi" w:hAnsiTheme="minorHAnsi" w:cstheme="minorHAnsi"/>
                 <w:b/>
                 <w:bCs/>
+                <w:sz w:val="22"/>
+                <w:szCs w:val="18"/>
               </w:rPr>
               <w:t>8º</w:t>
             </w:r>
@@ -937,7 +979,8 @@
         </w:tc>
         <w:tc>
           <w:tcPr>
-            <w:tcW w:w="437" w:type="pct"/>
+            <w:tcW w:w="890" w:type="dxa"/>
+            <w:gridSpan w:val="2"/>
             <w:vAlign w:val="center"/>
           </w:tcPr>
           <w:p>
@@ -948,6 +991,8 @@
                 <w:rFonts w:asciiTheme="minorHAnsi" w:hAnsiTheme="minorHAnsi" w:cstheme="minorHAnsi"/>
                 <w:b/>
                 <w:bCs/>
+                <w:sz w:val="22"/>
+                <w:szCs w:val="18"/>
               </w:rPr>
             </w:pPr>
             <w:r>
@@ -955,6 +1000,8 @@
                 <w:rFonts w:asciiTheme="minorHAnsi" w:hAnsiTheme="minorHAnsi" w:cstheme="minorHAnsi"/>
                 <w:b/>
                 <w:bCs/>
+                <w:sz w:val="22"/>
+                <w:szCs w:val="18"/>
               </w:rPr>
               <w:t>9º</w:t>
             </w:r>
@@ -962,7 +1009,7 @@
         </w:tc>
         <w:tc>
           <w:tcPr>
-            <w:tcW w:w="484" w:type="pct"/>
+            <w:tcW w:w="890" w:type="dxa"/>
             <w:vAlign w:val="center"/>
           </w:tcPr>
           <w:p>
@@ -973,6 +1020,8 @@
                 <w:rFonts w:asciiTheme="minorHAnsi" w:hAnsiTheme="minorHAnsi" w:cstheme="minorHAnsi"/>
                 <w:b/>
                 <w:bCs/>
+                <w:sz w:val="22"/>
+                <w:szCs w:val="18"/>
               </w:rPr>
             </w:pPr>
             <w:r>
@@ -980,6 +1029,8 @@
                 <w:rFonts w:asciiTheme="minorHAnsi" w:hAnsiTheme="minorHAnsi" w:cstheme="minorHAnsi"/>
                 <w:b/>
                 <w:bCs/>
+                <w:sz w:val="22"/>
+                <w:szCs w:val="18"/>
               </w:rPr>
               <w:t>10º</w:t>
             </w:r>
@@ -992,7 +1043,7 @@
         </w:trPr>
         <w:tc>
           <w:tcPr>
-            <w:tcW w:w="449" w:type="pct"/>
+            <w:tcW w:w="889" w:type="dxa"/>
             <w:vAlign w:val="center"/>
           </w:tcPr>
           <w:p>
@@ -1003,6 +1054,8 @@
                 <w:rFonts w:asciiTheme="minorHAnsi" w:hAnsiTheme="minorHAnsi" w:cstheme="minorHAnsi"/>
                 <w:b/>
                 <w:bCs/>
+                <w:sz w:val="22"/>
+                <w:szCs w:val="18"/>
               </w:rPr>
             </w:pPr>
             <w:r>
@@ -1010,6 +1063,8 @@
                 <w:rFonts w:asciiTheme="minorHAnsi" w:hAnsiTheme="minorHAnsi" w:cstheme="minorHAnsi"/>
                 <w:b/>
                 <w:bCs/>
+                <w:sz w:val="22"/>
+                <w:szCs w:val="18"/>
               </w:rPr>
               <w:t>VALOR</w:t>
             </w:r>
@@ -1017,7 +1072,8 @@
         </w:tc>
         <w:tc>
           <w:tcPr>
-            <w:tcW w:w="427" w:type="pct"/>
+            <w:tcW w:w="890" w:type="dxa"/>
+            <w:gridSpan w:val="2"/>
           </w:tcPr>
           <w:p>
             <w:pPr>
@@ -1025,11 +1081,15 @@
               <w:jc w:val="center"/>
               <w:rPr>
                 <w:rFonts w:asciiTheme="minorHAnsi" w:hAnsiTheme="minorHAnsi" w:cstheme="minorHAnsi"/>
+                <w:sz w:val="22"/>
+                <w:szCs w:val="18"/>
               </w:rPr>
             </w:pPr>
             <w:r>
               <w:rPr>
                 <w:rFonts w:asciiTheme="minorHAnsi" w:hAnsiTheme="minorHAnsi" w:cstheme="minorHAnsi"/>
+                <w:sz w:val="22"/>
+                <w:szCs w:val="18"/>
               </w:rPr>
               <w:t>[[b1]]</w:t>
             </w:r>
@@ -1037,7 +1097,7 @@
         </w:tc>
         <w:tc>
           <w:tcPr>
-            <w:tcW w:w="581" w:type="pct"/>
+            <w:tcW w:w="889" w:type="dxa"/>
           </w:tcPr>
           <w:p>
             <w:pPr>
@@ -1045,11 +1105,15 @@
               <w:jc w:val="center"/>
               <w:rPr>
                 <w:rFonts w:asciiTheme="minorHAnsi" w:hAnsiTheme="minorHAnsi" w:cstheme="minorHAnsi"/>
+                <w:sz w:val="22"/>
+                <w:szCs w:val="18"/>
               </w:rPr>
             </w:pPr>
             <w:r>
               <w:rPr>
                 <w:rFonts w:asciiTheme="minorHAnsi" w:hAnsiTheme="minorHAnsi" w:cstheme="minorHAnsi"/>
+                <w:sz w:val="22"/>
+                <w:szCs w:val="18"/>
               </w:rPr>
               <w:t>[[b2]]</w:t>
             </w:r>
@@ -1057,7 +1121,8 @@
         </w:tc>
         <w:tc>
           <w:tcPr>
-            <w:tcW w:w="438" w:type="pct"/>
+            <w:tcW w:w="890" w:type="dxa"/>
+            <w:gridSpan w:val="2"/>
           </w:tcPr>
           <w:p>
             <w:pPr>
@@ -1065,11 +1130,15 @@
               <w:jc w:val="center"/>
               <w:rPr>
                 <w:rFonts w:asciiTheme="minorHAnsi" w:hAnsiTheme="minorHAnsi" w:cstheme="minorHAnsi"/>
+                <w:sz w:val="22"/>
+                <w:szCs w:val="18"/>
               </w:rPr>
             </w:pPr>
             <w:r>
               <w:rPr>
                 <w:rFonts w:asciiTheme="minorHAnsi" w:hAnsiTheme="minorHAnsi" w:cstheme="minorHAnsi"/>
+                <w:sz w:val="22"/>
+                <w:szCs w:val="18"/>
               </w:rPr>
               <w:t>[[b3]]</w:t>
             </w:r>
@@ -1077,7 +1146,7 @@
         </w:tc>
         <w:tc>
           <w:tcPr>
-            <w:tcW w:w="438" w:type="pct"/>
+            <w:tcW w:w="890" w:type="dxa"/>
           </w:tcPr>
           <w:p>
             <w:pPr>
@@ -1085,11 +1154,15 @@
               <w:jc w:val="center"/>
               <w:rPr>
                 <w:rFonts w:asciiTheme="minorHAnsi" w:hAnsiTheme="minorHAnsi" w:cstheme="minorHAnsi"/>
+                <w:sz w:val="22"/>
+                <w:szCs w:val="18"/>
               </w:rPr>
             </w:pPr>
             <w:r>
               <w:rPr>
                 <w:rFonts w:asciiTheme="minorHAnsi" w:hAnsiTheme="minorHAnsi" w:cstheme="minorHAnsi"/>
+                <w:sz w:val="22"/>
+                <w:szCs w:val="18"/>
               </w:rPr>
               <w:t>[[b4]]</w:t>
             </w:r>
@@ -1097,7 +1170,7 @@
         </w:tc>
         <w:tc>
           <w:tcPr>
-            <w:tcW w:w="437" w:type="pct"/>
+            <w:tcW w:w="889" w:type="dxa"/>
             <w:vAlign w:val="center"/>
           </w:tcPr>
           <w:p>
@@ -1106,11 +1179,15 @@
               <w:jc w:val="center"/>
               <w:rPr>
                 <w:rFonts w:asciiTheme="minorHAnsi" w:hAnsiTheme="minorHAnsi" w:cstheme="minorHAnsi"/>
+                <w:sz w:val="22"/>
+                <w:szCs w:val="18"/>
               </w:rPr>
             </w:pPr>
             <w:r>
               <w:rPr>
                 <w:rFonts w:asciiTheme="minorHAnsi" w:hAnsiTheme="minorHAnsi" w:cstheme="minorHAnsi"/>
+                <w:sz w:val="22"/>
+                <w:szCs w:val="18"/>
               </w:rPr>
               <w:t>[[b5]]</w:t>
             </w:r>
@@ -1118,7 +1195,7 @@
         </w:tc>
         <w:tc>
           <w:tcPr>
-            <w:tcW w:w="437" w:type="pct"/>
+            <w:tcW w:w="890" w:type="dxa"/>
             <w:vAlign w:val="center"/>
           </w:tcPr>
           <w:p>
@@ -1127,11 +1204,15 @@
               <w:jc w:val="center"/>
               <w:rPr>
                 <w:rFonts w:asciiTheme="minorHAnsi" w:hAnsiTheme="minorHAnsi" w:cstheme="minorHAnsi"/>
+                <w:sz w:val="22"/>
+                <w:szCs w:val="18"/>
               </w:rPr>
             </w:pPr>
             <w:r>
               <w:rPr>
                 <w:rFonts w:asciiTheme="minorHAnsi" w:hAnsiTheme="minorHAnsi" w:cstheme="minorHAnsi"/>
+                <w:sz w:val="22"/>
+                <w:szCs w:val="18"/>
               </w:rPr>
               <w:t>[[b6]]</w:t>
             </w:r>
@@ -1139,7 +1220,7 @@
         </w:tc>
         <w:tc>
           <w:tcPr>
-            <w:tcW w:w="437" w:type="pct"/>
+            <w:tcW w:w="890" w:type="dxa"/>
             <w:vAlign w:val="center"/>
           </w:tcPr>
           <w:p>
@@ -1148,11 +1229,15 @@
               <w:jc w:val="center"/>
               <w:rPr>
                 <w:rFonts w:asciiTheme="minorHAnsi" w:hAnsiTheme="minorHAnsi" w:cstheme="minorHAnsi"/>
+                <w:sz w:val="22"/>
+                <w:szCs w:val="18"/>
               </w:rPr>
             </w:pPr>
             <w:r>
               <w:rPr>
                 <w:rFonts w:asciiTheme="minorHAnsi" w:hAnsiTheme="minorHAnsi" w:cstheme="minorHAnsi"/>
+                <w:sz w:val="22"/>
+                <w:szCs w:val="18"/>
               </w:rPr>
               <w:t>[[b7]]</w:t>
             </w:r>
@@ -1160,7 +1245,7 @@
         </w:tc>
         <w:tc>
           <w:tcPr>
-            <w:tcW w:w="437" w:type="pct"/>
+            <w:tcW w:w="889" w:type="dxa"/>
             <w:vAlign w:val="center"/>
           </w:tcPr>
           <w:p>
@@ -1169,11 +1254,15 @@
               <w:jc w:val="center"/>
               <w:rPr>
                 <w:rFonts w:asciiTheme="minorHAnsi" w:hAnsiTheme="minorHAnsi" w:cstheme="minorHAnsi"/>
+                <w:sz w:val="22"/>
+                <w:szCs w:val="18"/>
               </w:rPr>
             </w:pPr>
             <w:r>
               <w:rPr>
                 <w:rFonts w:asciiTheme="minorHAnsi" w:hAnsiTheme="minorHAnsi" w:cstheme="minorHAnsi"/>
+                <w:sz w:val="22"/>
+                <w:szCs w:val="18"/>
               </w:rPr>
               <w:t>[[b8]]</w:t>
             </w:r>
@@ -1181,7 +1270,8 @@
         </w:tc>
         <w:tc>
           <w:tcPr>
-            <w:tcW w:w="437" w:type="pct"/>
+            <w:tcW w:w="890" w:type="dxa"/>
+            <w:gridSpan w:val="2"/>
             <w:vAlign w:val="center"/>
           </w:tcPr>
           <w:p>
@@ -1190,11 +1280,15 @@
               <w:jc w:val="center"/>
               <w:rPr>
                 <w:rFonts w:asciiTheme="minorHAnsi" w:hAnsiTheme="minorHAnsi" w:cstheme="minorHAnsi"/>
+                <w:sz w:val="22"/>
+                <w:szCs w:val="18"/>
               </w:rPr>
             </w:pPr>
             <w:r>
               <w:rPr>
                 <w:rFonts w:asciiTheme="minorHAnsi" w:hAnsiTheme="minorHAnsi" w:cstheme="minorHAnsi"/>
+                <w:sz w:val="22"/>
+                <w:szCs w:val="18"/>
               </w:rPr>
               <w:t>[[b9]]</w:t>
             </w:r>
@@ -1202,7 +1296,7 @@
         </w:tc>
         <w:tc>
           <w:tcPr>
-            <w:tcW w:w="484" w:type="pct"/>
+            <w:tcW w:w="890" w:type="dxa"/>
             <w:vAlign w:val="center"/>
           </w:tcPr>
           <w:p>
@@ -1211,11 +1305,15 @@
               <w:jc w:val="center"/>
               <w:rPr>
                 <w:rFonts w:asciiTheme="minorHAnsi" w:hAnsiTheme="minorHAnsi" w:cstheme="minorHAnsi"/>
+                <w:sz w:val="22"/>
+                <w:szCs w:val="18"/>
               </w:rPr>
             </w:pPr>
             <w:r>
               <w:rPr>
                 <w:rFonts w:asciiTheme="minorHAnsi" w:hAnsiTheme="minorHAnsi" w:cstheme="minorHAnsi"/>
+                <w:sz w:val="22"/>
+                <w:szCs w:val="18"/>
               </w:rPr>
               <w:t>[[b10]]</w:t>
             </w:r>
@@ -1228,7 +1326,7 @@
         </w:trPr>
         <w:tc>
           <w:tcPr>
-            <w:tcW w:w="876" w:type="pct"/>
+            <w:tcW w:w="1662" w:type="dxa"/>
             <w:gridSpan w:val="2"/>
             <w:vAlign w:val="center"/>
           </w:tcPr>
@@ -1240,6 +1338,8 @@
                 <w:rFonts w:asciiTheme="minorHAnsi" w:hAnsiTheme="minorHAnsi" w:cstheme="minorHAnsi"/>
                 <w:b/>
                 <w:bCs/>
+                <w:sz w:val="22"/>
+                <w:szCs w:val="18"/>
               </w:rPr>
             </w:pPr>
             <w:r>
@@ -1247,6 +1347,8 @@
                 <w:rFonts w:asciiTheme="minorHAnsi" w:hAnsiTheme="minorHAnsi" w:cstheme="minorHAnsi"/>
                 <w:b/>
                 <w:bCs/>
+                <w:sz w:val="22"/>
+                <w:szCs w:val="18"/>
               </w:rPr>
               <w:t>MÉDIA:</w:t>
             </w:r>
@@ -1254,7 +1356,8 @@
         </w:tc>
         <w:tc>
           <w:tcPr>
-            <w:tcW w:w="581" w:type="pct"/>
+            <w:tcW w:w="1150" w:type="dxa"/>
+            <w:gridSpan w:val="3"/>
           </w:tcPr>
           <w:p>
             <w:pPr>
@@ -1264,6 +1367,8 @@
                 <w:rFonts w:asciiTheme="minorHAnsi" w:hAnsiTheme="minorHAnsi" w:cstheme="minorHAnsi"/>
                 <w:b/>
                 <w:bCs/>
+                <w:sz w:val="22"/>
+                <w:szCs w:val="18"/>
               </w:rPr>
             </w:pPr>
             <w:r>
@@ -1271,6 +1376,8 @@
                 <w:rFonts w:asciiTheme="minorHAnsi" w:hAnsiTheme="minorHAnsi" w:cstheme="minorHAnsi"/>
                 <w:b/>
                 <w:bCs/>
+                <w:sz w:val="22"/>
+                <w:szCs w:val="18"/>
               </w:rPr>
               <w:t>[[media]]</w:t>
             </w:r>
@@ -1278,7 +1385,7 @@
         </w:tc>
         <w:tc>
           <w:tcPr>
-            <w:tcW w:w="3059" w:type="pct"/>
+            <w:tcW w:w="6020" w:type="dxa"/>
             <w:gridSpan w:val="7"/>
           </w:tcPr>
           <w:p>
@@ -1289,6 +1396,8 @@
                 <w:rFonts w:asciiTheme="minorHAnsi" w:hAnsiTheme="minorHAnsi" w:cstheme="minorHAnsi"/>
                 <w:b/>
                 <w:bCs/>
+                <w:sz w:val="22"/>
+                <w:szCs w:val="18"/>
               </w:rPr>
             </w:pPr>
             <w:r>
@@ -1296,6 +1405,8 @@
                 <w:rFonts w:asciiTheme="minorHAnsi" w:hAnsiTheme="minorHAnsi" w:cstheme="minorHAnsi"/>
                 <w:b/>
                 <w:bCs/>
+                <w:sz w:val="22"/>
+                <w:szCs w:val="18"/>
               </w:rPr>
               <w:t>COEFICIENTE DE CORREÇÃO DO ÍNDICE ESCLEROMÉTRICO:</w:t>
             </w:r>
@@ -1303,7 +1414,8 @@
         </w:tc>
         <w:tc>
           <w:tcPr>
-            <w:tcW w:w="484" w:type="pct"/>
+            <w:tcW w:w="954" w:type="dxa"/>
+            <w:gridSpan w:val="2"/>
             <w:vAlign w:val="center"/>
           </w:tcPr>
           <w:p>
@@ -1314,6 +1426,8 @@
                 <w:rFonts w:asciiTheme="minorHAnsi" w:hAnsiTheme="minorHAnsi" w:cstheme="minorHAnsi"/>
                 <w:b/>
                 <w:bCs/>
+                <w:sz w:val="22"/>
+                <w:szCs w:val="18"/>
               </w:rPr>
             </w:pPr>
             <w:r>
@@ -1321,6 +1435,8 @@
                 <w:rFonts w:asciiTheme="minorHAnsi" w:hAnsiTheme="minorHAnsi" w:cstheme="minorHAnsi"/>
                 <w:b/>
                 <w:bCs/>
+                <w:sz w:val="22"/>
+                <w:szCs w:val="18"/>
               </w:rPr>
               <w:t>[[coef]]</w:t>
             </w:r>
@@ -1956,23 +2072,25 @@
           <w:lang w:eastAsia="pt-BR"/>
         </w:rPr>
       </w:pPr>
+    </w:p>
+    <w:p>
+      <w:pPr>
+        <w:keepNext/>
+        <w:ind w:firstLine="1418"/>
+        <w:rPr>
+          <w:rFonts w:asciiTheme="minorHAnsi" w:hAnsiTheme="minorHAnsi" w:cstheme="minorHAnsi"/>
+          <w:lang w:eastAsia="pt-BR"/>
+        </w:rPr>
+      </w:pPr>
       <w:r>
         <w:rPr>
           <w:noProof/>
           <w:lang w:eastAsia="pt-BR"/>
         </w:rPr>
         <w:drawing>
-          <wp:anchor distT="0" distB="0" distL="114300" distR="114300" simplePos="0" relativeHeight="251761664" behindDoc="1" locked="0" layoutInCell="1" allowOverlap="1" wp14:anchorId="0A969291" wp14:editId="314F9AA5">
-            <wp:simplePos x="0" y="0"/>
-            <wp:positionH relativeFrom="column">
-              <wp:posOffset>838200</wp:posOffset>
-            </wp:positionH>
-            <wp:positionV relativeFrom="paragraph">
-              <wp:posOffset>17780</wp:posOffset>
-            </wp:positionV>
+          <wp:inline distT="0" distB="0" distL="0" distR="0" wp14:anchorId="108CDB35" wp14:editId="06C23A54">
             <wp:extent cx="1362075" cy="619125"/>
-            <wp:effectExtent l="19050" t="0" r="9525" b="0"/>
-            <wp:wrapNone/>
+            <wp:effectExtent l="0" t="0" r="9525" b="9525"/>
             <wp:docPr id="612" name="Imagem 612" descr="Desenho com traços pretos em fundo branco  O conteúdo gerado por IA pode estar incorreto."/>
             <wp:cNvGraphicFramePr>
               <a:graphicFrameLocks xmlns:a="http://schemas.openxmlformats.org/drawingml/2006/main" noChangeAspect="1"/>
@@ -2015,23 +2133,9 @@
                 </pic:pic>
               </a:graphicData>
             </a:graphic>
-            <wp14:sizeRelH relativeFrom="margin">
-              <wp14:pctWidth>0</wp14:pctWidth>
-            </wp14:sizeRelH>
-            <wp14:sizeRelV relativeFrom="margin">
-              <wp14:pctHeight>0</wp14:pctHeight>
-            </wp14:sizeRelV>
-          </wp:anchor>
+          </wp:inline>
         </w:drawing>
       </w:r>
-    </w:p>
-    <w:p>
-      <w:pPr>
-        <w:rPr>
-          <w:rFonts w:asciiTheme="minorHAnsi" w:hAnsiTheme="minorHAnsi" w:cstheme="minorHAnsi"/>
-          <w:lang w:eastAsia="pt-BR"/>
-        </w:rPr>
-      </w:pPr>
     </w:p>
     <w:tbl>
       <w:tblPr>
@@ -7765,6 +7869,7 @@
   <w:style w:type="character" w:default="1" w:styleId="Fontepargpadro">
     <w:name w:val="Default Paragraph Font"/>
     <w:uiPriority w:val="1"/>
+    <w:semiHidden/>
     <w:unhideWhenUsed/>
   </w:style>
   <w:style w:type="table" w:default="1" w:styleId="Tabelanormal">

</xml_diff>

<commit_message>
feat: assinatura do responsável técnico por perfil de usuário
- Adiciona campos CREA e assinatura no perfil (user_metadata)
- Upload de imagem de assinatura via Supabase Storage (bucket: assinaturas)
- API route POST/DELETE /api/users/[id]/assinatura
- Aba Cabeçalho: responsável pré-preenchido do perfil logado
- Checkbox 'outro responsável' com campos nome, CREA e imagem local
- Route DOCX injeta assinatura no ZIP pós-render via XML inline
- Marcador [[resp_assinatura]] no template Word (célula direita)
</commit_message>
<xml_diff>
--- a/public/modelo_esclerometria.docx
+++ b/public/modelo_esclerometria.docx
@@ -2135,6 +2135,20 @@
             </a:graphic>
           </wp:inline>
         </w:drawing>
+      </w:r>
+      <w:r>
+        <w:rPr>
+          <w:rFonts w:asciiTheme="minorHAnsi" w:hAnsiTheme="minorHAnsi" w:cstheme="minorHAnsi"/>
+          <w:lang w:eastAsia="pt-BR"/>
+        </w:rPr>
+        <w:t xml:space="preserve">                                                       </w:t>
+      </w:r>
+      <w:r>
+        <w:rPr>
+          <w:rFonts w:asciiTheme="minorHAnsi" w:hAnsiTheme="minorHAnsi" w:cstheme="minorHAnsi"/>
+          <w:lang w:eastAsia="pt-BR"/>
+        </w:rPr>
+        <w:t>[[resp_assinatura]]</w:t>
       </w:r>
     </w:p>
     <w:tbl>
@@ -7869,7 +7883,6 @@
   <w:style w:type="character" w:default="1" w:styleId="Fontepargpadro">
     <w:name w:val="Default Paragraph Font"/>
     <w:uiPriority w:val="1"/>
-    <w:semiHidden/>
     <w:unhideWhenUsed/>
   </w:style>
   <w:style w:type="table" w:default="1" w:styleId="Tabelanormal">

</xml_diff>

<commit_message>
feat: novos campos no relatório esclerometria — mapa, motivação, foto geral, croqui, memorial fotográfico
</commit_message>
<xml_diff>
--- a/public/modelo_esclerometria.docx
+++ b/public/modelo_esclerometria.docx
@@ -586,6 +586,627 @@
     </w:p>
     <w:p>
       <w:pPr>
+        <w:spacing w:line="360" w:lineRule="auto"/>
+        <w:jc w:val="center"/>
+        <w:rPr>
+          <w:rFonts w:asciiTheme="minorHAnsi" w:hAnsiTheme="minorHAnsi"/>
+          <w:b/>
+          <w:sz w:val="28"/>
+          <w:szCs w:val="28"/>
+        </w:rPr>
+      </w:pPr>
+      <w:r>
+        <w:rPr>
+          <w:rFonts w:asciiTheme="minorHAnsi" w:hAnsiTheme="minorHAnsi"/>
+          <w:b/>
+          <w:sz w:val="28"/>
+          <w:szCs w:val="28"/>
+        </w:rPr>
+        <w:lastRenderedPageBreak/>
+        <w:t>SUMÁRIO</w:t>
+      </w:r>
+    </w:p>
+    <w:p>
+      <w:pPr>
+        <w:pStyle w:val="Sumrio1"/>
+        <w:tabs>
+          <w:tab w:val="left" w:pos="480"/>
+          <w:tab w:val="right" w:leader="dot" w:pos="10054"/>
+        </w:tabs>
+        <w:rPr>
+          <w:rFonts w:asciiTheme="minorHAnsi" w:eastAsiaTheme="minorEastAsia" w:hAnsiTheme="minorHAnsi" w:cstheme="minorBidi"/>
+          <w:b w:val="0"/>
+          <w:bCs w:val="0"/>
+          <w:caps w:val="0"/>
+          <w:noProof/>
+          <w:kern w:val="2"/>
+          <w:sz w:val="24"/>
+          <w:szCs w:val="24"/>
+          <w:lang w:eastAsia="pt-BR"/>
+          <w14:ligatures w14:val="standardContextual"/>
+        </w:rPr>
+      </w:pPr>
+      <w:r>
+        <w:rPr>
+          <w:rFonts w:asciiTheme="minorHAnsi" w:hAnsiTheme="minorHAnsi" w:cstheme="minorHAnsi"/>
+        </w:rPr>
+        <w:fldChar w:fldCharType="begin"/>
+      </w:r>
+      <w:r>
+        <w:rPr>
+          <w:rFonts w:asciiTheme="minorHAnsi" w:hAnsiTheme="minorHAnsi" w:cstheme="minorHAnsi"/>
+        </w:rPr>
+        <w:instrText xml:space="preserve"> TOC \o "1-3" \u </w:instrText>
+      </w:r>
+      <w:r>
+        <w:rPr>
+          <w:rFonts w:asciiTheme="minorHAnsi" w:hAnsiTheme="minorHAnsi" w:cstheme="minorHAnsi"/>
+        </w:rPr>
+        <w:fldChar w:fldCharType="separate"/>
+      </w:r>
+      <w:r>
+        <w:rPr>
+          <w:rFonts w:asciiTheme="minorHAnsi" w:hAnsiTheme="minorHAnsi"/>
+          <w:noProof/>
+        </w:rPr>
+        <w:t>1.</w:t>
+      </w:r>
+      <w:r>
+        <w:rPr>
+          <w:rFonts w:asciiTheme="minorHAnsi" w:eastAsiaTheme="minorEastAsia" w:hAnsiTheme="minorHAnsi" w:cstheme="minorBidi"/>
+          <w:b w:val="0"/>
+          <w:bCs w:val="0"/>
+          <w:caps w:val="0"/>
+          <w:noProof/>
+          <w:kern w:val="2"/>
+          <w:sz w:val="24"/>
+          <w:szCs w:val="24"/>
+          <w:lang w:eastAsia="pt-BR"/>
+          <w14:ligatures w14:val="standardContextual"/>
+        </w:rPr>
+        <w:tab/>
+      </w:r>
+      <w:r>
+        <w:rPr>
+          <w:rFonts w:asciiTheme="minorHAnsi" w:hAnsiTheme="minorHAnsi"/>
+          <w:noProof/>
+        </w:rPr>
+        <w:t>INTRODUÇÃO</w:t>
+      </w:r>
+      <w:r>
+        <w:rPr>
+          <w:noProof/>
+        </w:rPr>
+        <w:tab/>
+      </w:r>
+      <w:r>
+        <w:rPr>
+          <w:noProof/>
+        </w:rPr>
+        <w:fldChar w:fldCharType="begin"/>
+      </w:r>
+      <w:r>
+        <w:rPr>
+          <w:noProof/>
+        </w:rPr>
+        <w:instrText xml:space="preserve"> PAGEREF _Toc229498014 \h </w:instrText>
+      </w:r>
+      <w:r>
+        <w:rPr>
+          <w:noProof/>
+        </w:rPr>
+      </w:r>
+      <w:r>
+        <w:rPr>
+          <w:noProof/>
+        </w:rPr>
+        <w:fldChar w:fldCharType="separate"/>
+      </w:r>
+      <w:r>
+        <w:rPr>
+          <w:noProof/>
+        </w:rPr>
+        <w:t>3</w:t>
+      </w:r>
+      <w:r>
+        <w:rPr>
+          <w:noProof/>
+        </w:rPr>
+        <w:fldChar w:fldCharType="end"/>
+      </w:r>
+    </w:p>
+    <w:p>
+      <w:pPr>
+        <w:pStyle w:val="Sumrio1"/>
+        <w:tabs>
+          <w:tab w:val="left" w:pos="480"/>
+          <w:tab w:val="right" w:leader="dot" w:pos="10054"/>
+        </w:tabs>
+        <w:rPr>
+          <w:rFonts w:asciiTheme="minorHAnsi" w:eastAsiaTheme="minorEastAsia" w:hAnsiTheme="minorHAnsi" w:cstheme="minorBidi"/>
+          <w:b w:val="0"/>
+          <w:bCs w:val="0"/>
+          <w:caps w:val="0"/>
+          <w:noProof/>
+          <w:kern w:val="2"/>
+          <w:sz w:val="24"/>
+          <w:szCs w:val="24"/>
+          <w:lang w:eastAsia="pt-BR"/>
+          <w14:ligatures w14:val="standardContextual"/>
+        </w:rPr>
+      </w:pPr>
+      <w:r>
+        <w:rPr>
+          <w:rFonts w:asciiTheme="minorHAnsi" w:hAnsiTheme="minorHAnsi"/>
+          <w:noProof/>
+        </w:rPr>
+        <w:t>2.</w:t>
+      </w:r>
+      <w:r>
+        <w:rPr>
+          <w:rFonts w:asciiTheme="minorHAnsi" w:eastAsiaTheme="minorEastAsia" w:hAnsiTheme="minorHAnsi" w:cstheme="minorBidi"/>
+          <w:b w:val="0"/>
+          <w:bCs w:val="0"/>
+          <w:caps w:val="0"/>
+          <w:noProof/>
+          <w:kern w:val="2"/>
+          <w:sz w:val="24"/>
+          <w:szCs w:val="24"/>
+          <w:lang w:eastAsia="pt-BR"/>
+          <w14:ligatures w14:val="standardContextual"/>
+        </w:rPr>
+        <w:tab/>
+      </w:r>
+      <w:r>
+        <w:rPr>
+          <w:rFonts w:asciiTheme="minorHAnsi" w:hAnsiTheme="minorHAnsi"/>
+          <w:noProof/>
+        </w:rPr>
+        <w:t>METODOLOGIA DE ENSAIO</w:t>
+      </w:r>
+      <w:r>
+        <w:rPr>
+          <w:noProof/>
+        </w:rPr>
+        <w:tab/>
+      </w:r>
+      <w:r>
+        <w:rPr>
+          <w:noProof/>
+        </w:rPr>
+        <w:fldChar w:fldCharType="begin"/>
+      </w:r>
+      <w:r>
+        <w:rPr>
+          <w:noProof/>
+        </w:rPr>
+        <w:instrText xml:space="preserve"> PAGEREF _Toc229498015 \h </w:instrText>
+      </w:r>
+      <w:r>
+        <w:rPr>
+          <w:noProof/>
+        </w:rPr>
+      </w:r>
+      <w:r>
+        <w:rPr>
+          <w:noProof/>
+        </w:rPr>
+        <w:fldChar w:fldCharType="separate"/>
+      </w:r>
+      <w:r>
+        <w:rPr>
+          <w:noProof/>
+        </w:rPr>
+        <w:t>3</w:t>
+      </w:r>
+      <w:r>
+        <w:rPr>
+          <w:noProof/>
+        </w:rPr>
+        <w:fldChar w:fldCharType="end"/>
+      </w:r>
+    </w:p>
+    <w:p>
+      <w:pPr>
+        <w:pStyle w:val="Sumrio1"/>
+        <w:tabs>
+          <w:tab w:val="left" w:pos="480"/>
+          <w:tab w:val="right" w:leader="dot" w:pos="10054"/>
+        </w:tabs>
+        <w:rPr>
+          <w:rFonts w:asciiTheme="minorHAnsi" w:eastAsiaTheme="minorEastAsia" w:hAnsiTheme="minorHAnsi" w:cstheme="minorBidi"/>
+          <w:b w:val="0"/>
+          <w:bCs w:val="0"/>
+          <w:caps w:val="0"/>
+          <w:noProof/>
+          <w:kern w:val="2"/>
+          <w:sz w:val="24"/>
+          <w:szCs w:val="24"/>
+          <w:lang w:eastAsia="pt-BR"/>
+          <w14:ligatures w14:val="standardContextual"/>
+        </w:rPr>
+      </w:pPr>
+      <w:r>
+        <w:rPr>
+          <w:rFonts w:asciiTheme="minorHAnsi" w:hAnsiTheme="minorHAnsi"/>
+          <w:noProof/>
+        </w:rPr>
+        <w:t>3.</w:t>
+      </w:r>
+      <w:r>
+        <w:rPr>
+          <w:rFonts w:asciiTheme="minorHAnsi" w:eastAsiaTheme="minorEastAsia" w:hAnsiTheme="minorHAnsi" w:cstheme="minorBidi"/>
+          <w:b w:val="0"/>
+          <w:bCs w:val="0"/>
+          <w:caps w:val="0"/>
+          <w:noProof/>
+          <w:kern w:val="2"/>
+          <w:sz w:val="24"/>
+          <w:szCs w:val="24"/>
+          <w:lang w:eastAsia="pt-BR"/>
+          <w14:ligatures w14:val="standardContextual"/>
+        </w:rPr>
+        <w:tab/>
+      </w:r>
+      <w:r>
+        <w:rPr>
+          <w:rFonts w:asciiTheme="minorHAnsi" w:hAnsiTheme="minorHAnsi"/>
+          <w:noProof/>
+        </w:rPr>
+        <w:t>ÍNDICE ESCLEROMÉTRICO DA VERIFICAÇÃO DO APARELHO</w:t>
+      </w:r>
+      <w:r>
+        <w:rPr>
+          <w:noProof/>
+        </w:rPr>
+        <w:tab/>
+      </w:r>
+      <w:r>
+        <w:rPr>
+          <w:noProof/>
+        </w:rPr>
+        <w:fldChar w:fldCharType="begin"/>
+      </w:r>
+      <w:r>
+        <w:rPr>
+          <w:noProof/>
+        </w:rPr>
+        <w:instrText xml:space="preserve"> PAGEREF _Toc229498016 \h </w:instrText>
+      </w:r>
+      <w:r>
+        <w:rPr>
+          <w:noProof/>
+        </w:rPr>
+      </w:r>
+      <w:r>
+        <w:rPr>
+          <w:noProof/>
+        </w:rPr>
+        <w:fldChar w:fldCharType="separate"/>
+      </w:r>
+      <w:r>
+        <w:rPr>
+          <w:noProof/>
+        </w:rPr>
+        <w:t>5</w:t>
+      </w:r>
+      <w:r>
+        <w:rPr>
+          <w:noProof/>
+        </w:rPr>
+        <w:fldChar w:fldCharType="end"/>
+      </w:r>
+    </w:p>
+    <w:p>
+      <w:pPr>
+        <w:pStyle w:val="Sumrio1"/>
+        <w:tabs>
+          <w:tab w:val="left" w:pos="480"/>
+          <w:tab w:val="right" w:leader="dot" w:pos="10054"/>
+        </w:tabs>
+        <w:rPr>
+          <w:rFonts w:asciiTheme="minorHAnsi" w:eastAsiaTheme="minorEastAsia" w:hAnsiTheme="minorHAnsi" w:cstheme="minorBidi"/>
+          <w:b w:val="0"/>
+          <w:bCs w:val="0"/>
+          <w:caps w:val="0"/>
+          <w:noProof/>
+          <w:kern w:val="2"/>
+          <w:sz w:val="24"/>
+          <w:szCs w:val="24"/>
+          <w:lang w:eastAsia="pt-BR"/>
+          <w14:ligatures w14:val="standardContextual"/>
+        </w:rPr>
+      </w:pPr>
+      <w:r>
+        <w:rPr>
+          <w:rFonts w:asciiTheme="minorHAnsi" w:hAnsiTheme="minorHAnsi"/>
+          <w:noProof/>
+        </w:rPr>
+        <w:t>4.</w:t>
+      </w:r>
+      <w:r>
+        <w:rPr>
+          <w:rFonts w:asciiTheme="minorHAnsi" w:eastAsiaTheme="minorEastAsia" w:hAnsiTheme="minorHAnsi" w:cstheme="minorBidi"/>
+          <w:b w:val="0"/>
+          <w:bCs w:val="0"/>
+          <w:caps w:val="0"/>
+          <w:noProof/>
+          <w:kern w:val="2"/>
+          <w:sz w:val="24"/>
+          <w:szCs w:val="24"/>
+          <w:lang w:eastAsia="pt-BR"/>
+          <w14:ligatures w14:val="standardContextual"/>
+        </w:rPr>
+        <w:tab/>
+      </w:r>
+      <w:r>
+        <w:rPr>
+          <w:rFonts w:asciiTheme="minorHAnsi" w:hAnsiTheme="minorHAnsi"/>
+          <w:noProof/>
+        </w:rPr>
+        <w:t>POSIÇÕES DE APLICAÇÃO DO EQUIPAMENTO</w:t>
+      </w:r>
+      <w:r>
+        <w:rPr>
+          <w:noProof/>
+        </w:rPr>
+        <w:tab/>
+      </w:r>
+      <w:r>
+        <w:rPr>
+          <w:noProof/>
+        </w:rPr>
+        <w:fldChar w:fldCharType="begin"/>
+      </w:r>
+      <w:r>
+        <w:rPr>
+          <w:noProof/>
+        </w:rPr>
+        <w:instrText xml:space="preserve"> PAGEREF _Toc229498017 \h </w:instrText>
+      </w:r>
+      <w:r>
+        <w:rPr>
+          <w:noProof/>
+        </w:rPr>
+      </w:r>
+      <w:r>
+        <w:rPr>
+          <w:noProof/>
+        </w:rPr>
+        <w:fldChar w:fldCharType="separate"/>
+      </w:r>
+      <w:r>
+        <w:rPr>
+          <w:noProof/>
+        </w:rPr>
+        <w:t>5</w:t>
+      </w:r>
+      <w:r>
+        <w:rPr>
+          <w:noProof/>
+        </w:rPr>
+        <w:fldChar w:fldCharType="end"/>
+      </w:r>
+    </w:p>
+    <w:p>
+      <w:pPr>
+        <w:pStyle w:val="Sumrio1"/>
+        <w:tabs>
+          <w:tab w:val="left" w:pos="480"/>
+          <w:tab w:val="right" w:leader="dot" w:pos="10054"/>
+        </w:tabs>
+        <w:rPr>
+          <w:rFonts w:asciiTheme="minorHAnsi" w:eastAsiaTheme="minorEastAsia" w:hAnsiTheme="minorHAnsi" w:cstheme="minorBidi"/>
+          <w:b w:val="0"/>
+          <w:bCs w:val="0"/>
+          <w:caps w:val="0"/>
+          <w:noProof/>
+          <w:kern w:val="2"/>
+          <w:sz w:val="24"/>
+          <w:szCs w:val="24"/>
+          <w:lang w:eastAsia="pt-BR"/>
+          <w14:ligatures w14:val="standardContextual"/>
+        </w:rPr>
+      </w:pPr>
+      <w:r>
+        <w:rPr>
+          <w:rFonts w:asciiTheme="minorHAnsi" w:hAnsiTheme="minorHAnsi"/>
+          <w:noProof/>
+        </w:rPr>
+        <w:t>5.</w:t>
+      </w:r>
+      <w:r>
+        <w:rPr>
+          <w:rFonts w:asciiTheme="minorHAnsi" w:eastAsiaTheme="minorEastAsia" w:hAnsiTheme="minorHAnsi" w:cstheme="minorBidi"/>
+          <w:b w:val="0"/>
+          <w:bCs w:val="0"/>
+          <w:caps w:val="0"/>
+          <w:noProof/>
+          <w:kern w:val="2"/>
+          <w:sz w:val="24"/>
+          <w:szCs w:val="24"/>
+          <w:lang w:eastAsia="pt-BR"/>
+          <w14:ligatures w14:val="standardContextual"/>
+        </w:rPr>
+        <w:tab/>
+      </w:r>
+      <w:r>
+        <w:rPr>
+          <w:rFonts w:asciiTheme="minorHAnsi" w:hAnsiTheme="minorHAnsi"/>
+          <w:noProof/>
+        </w:rPr>
+        <w:t>RESULTADOS DE ENSAIO</w:t>
+      </w:r>
+      <w:r>
+        <w:rPr>
+          <w:noProof/>
+        </w:rPr>
+        <w:tab/>
+      </w:r>
+      <w:r>
+        <w:rPr>
+          <w:noProof/>
+        </w:rPr>
+        <w:fldChar w:fldCharType="begin"/>
+      </w:r>
+      <w:r>
+        <w:rPr>
+          <w:noProof/>
+        </w:rPr>
+        <w:instrText xml:space="preserve"> PAGEREF _Toc229498018 \h </w:instrText>
+      </w:r>
+      <w:r>
+        <w:rPr>
+          <w:noProof/>
+        </w:rPr>
+      </w:r>
+      <w:r>
+        <w:rPr>
+          <w:noProof/>
+        </w:rPr>
+        <w:fldChar w:fldCharType="separate"/>
+      </w:r>
+      <w:r>
+        <w:rPr>
+          <w:noProof/>
+        </w:rPr>
+        <w:t>6</w:t>
+      </w:r>
+      <w:r>
+        <w:rPr>
+          <w:noProof/>
+        </w:rPr>
+        <w:fldChar w:fldCharType="end"/>
+      </w:r>
+    </w:p>
+    <w:p>
+      <w:pPr>
+        <w:pStyle w:val="Sumrio1"/>
+        <w:tabs>
+          <w:tab w:val="left" w:pos="480"/>
+          <w:tab w:val="right" w:leader="dot" w:pos="10054"/>
+        </w:tabs>
+        <w:rPr>
+          <w:rFonts w:asciiTheme="minorHAnsi" w:eastAsiaTheme="minorEastAsia" w:hAnsiTheme="minorHAnsi" w:cstheme="minorBidi"/>
+          <w:b w:val="0"/>
+          <w:bCs w:val="0"/>
+          <w:caps w:val="0"/>
+          <w:noProof/>
+          <w:kern w:val="2"/>
+          <w:sz w:val="24"/>
+          <w:szCs w:val="24"/>
+          <w:lang w:eastAsia="pt-BR"/>
+          <w14:ligatures w14:val="standardContextual"/>
+        </w:rPr>
+      </w:pPr>
+      <w:r>
+        <w:rPr>
+          <w:rFonts w:asciiTheme="minorHAnsi" w:hAnsiTheme="minorHAnsi"/>
+          <w:noProof/>
+        </w:rPr>
+        <w:t>6.</w:t>
+      </w:r>
+      <w:r>
+        <w:rPr>
+          <w:rFonts w:asciiTheme="minorHAnsi" w:eastAsiaTheme="minorEastAsia" w:hAnsiTheme="minorHAnsi" w:cstheme="minorBidi"/>
+          <w:b w:val="0"/>
+          <w:bCs w:val="0"/>
+          <w:caps w:val="0"/>
+          <w:noProof/>
+          <w:kern w:val="2"/>
+          <w:sz w:val="24"/>
+          <w:szCs w:val="24"/>
+          <w:lang w:eastAsia="pt-BR"/>
+          <w14:ligatures w14:val="standardContextual"/>
+        </w:rPr>
+        <w:tab/>
+      </w:r>
+      <w:r>
+        <w:rPr>
+          <w:rFonts w:asciiTheme="minorHAnsi" w:hAnsiTheme="minorHAnsi"/>
+          <w:noProof/>
+        </w:rPr>
+        <w:t>NOTAS</w:t>
+      </w:r>
+      <w:r>
+        <w:rPr>
+          <w:noProof/>
+        </w:rPr>
+        <w:tab/>
+      </w:r>
+      <w:r>
+        <w:rPr>
+          <w:noProof/>
+        </w:rPr>
+        <w:fldChar w:fldCharType="begin"/>
+      </w:r>
+      <w:r>
+        <w:rPr>
+          <w:noProof/>
+        </w:rPr>
+        <w:instrText xml:space="preserve"> PAGEREF _Toc229498019 \h </w:instrText>
+      </w:r>
+      <w:r>
+        <w:rPr>
+          <w:noProof/>
+        </w:rPr>
+      </w:r>
+      <w:r>
+        <w:rPr>
+          <w:noProof/>
+        </w:rPr>
+        <w:fldChar w:fldCharType="separate"/>
+      </w:r>
+      <w:r>
+        <w:rPr>
+          <w:noProof/>
+        </w:rPr>
+        <w:t>6</w:t>
+      </w:r>
+      <w:r>
+        <w:rPr>
+          <w:noProof/>
+        </w:rPr>
+        <w:fldChar w:fldCharType="end"/>
+      </w:r>
+    </w:p>
+    <w:p>
+      <w:pPr>
+        <w:rPr>
+          <w:rFonts w:asciiTheme="minorHAnsi" w:hAnsiTheme="minorHAnsi"/>
+          <w:b/>
+          <w:sz w:val="28"/>
+          <w:szCs w:val="28"/>
+        </w:rPr>
+      </w:pPr>
+      <w:r>
+        <w:rPr>
+          <w:rFonts w:asciiTheme="minorHAnsi" w:hAnsiTheme="minorHAnsi" w:cstheme="minorHAnsi"/>
+        </w:rPr>
+        <w:fldChar w:fldCharType="end"/>
+      </w:r>
+    </w:p>
+    <w:p>
+      <w:pPr>
+        <w:rPr>
+          <w:rFonts w:asciiTheme="minorHAnsi" w:hAnsiTheme="minorHAnsi"/>
+          <w:b/>
+          <w:sz w:val="28"/>
+          <w:szCs w:val="28"/>
+        </w:rPr>
+      </w:pPr>
+      <w:r>
+        <w:rPr>
+          <w:rFonts w:asciiTheme="minorHAnsi" w:hAnsiTheme="minorHAnsi"/>
+          <w:b/>
+          <w:sz w:val="28"/>
+          <w:szCs w:val="28"/>
+        </w:rPr>
+        <w:br w:type="page"/>
+      </w:r>
+    </w:p>
+    <w:p>
+      <w:pPr>
         <w:spacing w:before="240" w:after="240"/>
         <w:jc w:val="right"/>
         <w:rPr>
@@ -613,26 +1234,379 @@
           <w:rFonts w:asciiTheme="minorHAnsi" w:hAnsiTheme="minorHAnsi"/>
         </w:rPr>
       </w:pPr>
+      <w:bookmarkStart w:id="0" w:name="_Toc229498014"/>
       <w:r>
         <w:rPr>
           <w:rFonts w:asciiTheme="minorHAnsi" w:hAnsiTheme="minorHAnsi"/>
         </w:rPr>
-        <w:t>NORMA DE REFERÊNCIA</w:t>
-      </w:r>
+        <w:t>INTRODUÇÃO</w:t>
+      </w:r>
+      <w:bookmarkEnd w:id="0"/>
     </w:p>
     <w:p>
       <w:pPr>
-        <w:spacing w:before="240" w:after="240"/>
-        <w:ind w:firstLine="851"/>
-        <w:rPr>
-          <w:rFonts w:asciiTheme="minorHAnsi" w:hAnsiTheme="minorHAnsi" w:cstheme="minorHAnsi"/>
-        </w:rPr>
-      </w:pPr>
-      <w:r>
-        <w:rPr>
-          <w:rFonts w:asciiTheme="minorHAnsi" w:hAnsiTheme="minorHAnsi" w:cstheme="minorHAnsi"/>
-        </w:rPr>
-        <w:t>NBR 7584:2012 - concreto endurecido - avaliação da dureza superficial pelo esclerômetro de reflexão - método de ensaio.</w:t>
+        <w:spacing w:before="240" w:after="240" w:line="360" w:lineRule="auto"/>
+        <w:ind w:firstLine="709"/>
+        <w:rPr>
+          <w:rFonts w:asciiTheme="minorHAnsi" w:hAnsiTheme="minorHAnsi" w:cstheme="minorHAnsi"/>
+        </w:rPr>
+      </w:pPr>
+      <w:r>
+        <w:rPr>
+          <w:rFonts w:asciiTheme="minorHAnsi" w:hAnsiTheme="minorHAnsi" w:cstheme="minorHAnsi"/>
+        </w:rPr>
+        <w:t xml:space="preserve">O presente relatório trata dos resultados do ensaio de esclerometria realizado em elementos de concreto armado da estrutura </w:t>
+      </w:r>
+      <w:r>
+        <w:rPr>
+          <w:rFonts w:asciiTheme="minorHAnsi" w:hAnsiTheme="minorHAnsi" w:cstheme="minorHAnsi"/>
+        </w:rPr>
+        <w:t xml:space="preserve">da obra </w:t>
+      </w:r>
+      <w:r>
+        <w:rPr>
+          <w:rFonts w:asciiTheme="minorHAnsi" w:hAnsiTheme="minorHAnsi"/>
+          <w:color w:val="0F243E" w:themeColor="text2" w:themeShade="80"/>
+        </w:rPr>
+        <w:t>[[obra]]</w:t>
+      </w:r>
+      <w:r>
+        <w:rPr>
+          <w:rFonts w:asciiTheme="minorHAnsi" w:hAnsiTheme="minorHAnsi" w:cstheme="minorHAnsi"/>
+        </w:rPr>
+        <w:t xml:space="preserve">. O empreendimento fica localizado na </w:t>
+      </w:r>
+      <w:r>
+        <w:rPr>
+          <w:rFonts w:asciiTheme="minorHAnsi" w:hAnsiTheme="minorHAnsi" w:cstheme="minorHAnsi"/>
+        </w:rPr>
+        <w:t>[[endereco]]</w:t>
+      </w:r>
+      <w:r>
+        <w:rPr>
+          <w:rFonts w:asciiTheme="minorHAnsi" w:hAnsiTheme="minorHAnsi" w:cstheme="minorHAnsi"/>
+        </w:rPr>
+        <w:t xml:space="preserve">, como observado na </w:t>
+      </w:r>
+      <w:r>
+        <w:rPr>
+          <w:rFonts w:asciiTheme="minorHAnsi" w:hAnsiTheme="minorHAnsi" w:cstheme="minorHAnsi"/>
+        </w:rPr>
+        <w:fldChar w:fldCharType="begin"/>
+      </w:r>
+      <w:r>
+        <w:rPr>
+          <w:rFonts w:asciiTheme="minorHAnsi" w:hAnsiTheme="minorHAnsi" w:cstheme="minorHAnsi"/>
+        </w:rPr>
+        <w:instrText xml:space="preserve"> REF _Ref229497795 \h </w:instrText>
+      </w:r>
+      <w:r>
+        <w:rPr>
+          <w:rFonts w:asciiTheme="minorHAnsi" w:hAnsiTheme="minorHAnsi" w:cstheme="minorHAnsi"/>
+        </w:rPr>
+      </w:r>
+      <w:r>
+        <w:rPr>
+          <w:rFonts w:asciiTheme="minorHAnsi" w:hAnsiTheme="minorHAnsi" w:cstheme="minorHAnsi"/>
+        </w:rPr>
+        <w:fldChar w:fldCharType="separate"/>
+      </w:r>
+      <w:r>
+        <w:rPr>
+          <w:rFonts w:asciiTheme="minorHAnsi" w:hAnsiTheme="minorHAnsi" w:cstheme="minorHAnsi"/>
+        </w:rPr>
+        <w:t xml:space="preserve">Figura </w:t>
+      </w:r>
+      <w:r>
+        <w:rPr>
+          <w:rFonts w:asciiTheme="minorHAnsi" w:hAnsiTheme="minorHAnsi" w:cstheme="minorHAnsi"/>
+          <w:noProof/>
+        </w:rPr>
+        <w:t>1</w:t>
+      </w:r>
+      <w:r>
+        <w:rPr>
+          <w:rFonts w:asciiTheme="minorHAnsi" w:hAnsiTheme="minorHAnsi" w:cstheme="minorHAnsi"/>
+        </w:rPr>
+        <w:fldChar w:fldCharType="end"/>
+      </w:r>
+      <w:r>
+        <w:rPr>
+          <w:rFonts w:asciiTheme="minorHAnsi" w:hAnsiTheme="minorHAnsi" w:cstheme="minorHAnsi"/>
+        </w:rPr>
+        <w:t>.</w:t>
+      </w:r>
+    </w:p>
+    <w:p>
+      <w:pPr>
+        <w:spacing w:before="240" w:after="240" w:line="360" w:lineRule="auto"/>
+        <w:jc w:val="center"/>
+        <w:rPr>
+          <w:rFonts w:asciiTheme="minorHAnsi" w:hAnsiTheme="minorHAnsi" w:cstheme="minorHAnsi"/>
+        </w:rPr>
+      </w:pPr>
+      <w:r>
+        <w:rPr>
+          <w:rFonts w:asciiTheme="minorHAnsi" w:hAnsiTheme="minorHAnsi" w:cstheme="minorHAnsi"/>
+        </w:rPr>
+        <w:t>[[mapa]]</w:t>
+      </w:r>
+    </w:p>
+    <w:p>
+      <w:pPr>
+        <w:pStyle w:val="Legenda"/>
+        <w:jc w:val="center"/>
+        <w:rPr>
+          <w:rFonts w:asciiTheme="minorHAnsi" w:hAnsiTheme="minorHAnsi" w:cstheme="minorHAnsi"/>
+        </w:rPr>
+      </w:pPr>
+      <w:bookmarkStart w:id="1" w:name="_Ref229497795"/>
+      <w:r>
+        <w:rPr>
+          <w:rFonts w:asciiTheme="minorHAnsi" w:hAnsiTheme="minorHAnsi" w:cstheme="minorHAnsi"/>
+        </w:rPr>
+        <w:t xml:space="preserve">Figura </w:t>
+      </w:r>
+      <w:r>
+        <w:rPr>
+          <w:rFonts w:asciiTheme="minorHAnsi" w:hAnsiTheme="minorHAnsi" w:cstheme="minorHAnsi"/>
+        </w:rPr>
+        <w:fldChar w:fldCharType="begin"/>
+      </w:r>
+      <w:r>
+        <w:rPr>
+          <w:rFonts w:asciiTheme="minorHAnsi" w:hAnsiTheme="minorHAnsi" w:cstheme="minorHAnsi"/>
+        </w:rPr>
+        <w:instrText xml:space="preserve"> SEQ Figura \* ARABIC </w:instrText>
+      </w:r>
+      <w:r>
+        <w:rPr>
+          <w:rFonts w:asciiTheme="minorHAnsi" w:hAnsiTheme="minorHAnsi" w:cstheme="minorHAnsi"/>
+        </w:rPr>
+        <w:fldChar w:fldCharType="separate"/>
+      </w:r>
+      <w:r>
+        <w:rPr>
+          <w:rFonts w:asciiTheme="minorHAnsi" w:hAnsiTheme="minorHAnsi" w:cstheme="minorHAnsi"/>
+          <w:noProof/>
+        </w:rPr>
+        <w:t>1</w:t>
+      </w:r>
+      <w:r>
+        <w:rPr>
+          <w:rFonts w:asciiTheme="minorHAnsi" w:hAnsiTheme="minorHAnsi" w:cstheme="minorHAnsi"/>
+        </w:rPr>
+        <w:fldChar w:fldCharType="end"/>
+      </w:r>
+      <w:bookmarkEnd w:id="1"/>
+      <w:r>
+        <w:rPr>
+          <w:rFonts w:asciiTheme="minorHAnsi" w:hAnsiTheme="minorHAnsi" w:cstheme="minorHAnsi"/>
+        </w:rPr>
+        <w:t xml:space="preserve"> </w:t>
+      </w:r>
+      <w:r>
+        <w:rPr>
+          <w:rFonts w:asciiTheme="minorHAnsi" w:hAnsiTheme="minorHAnsi" w:cstheme="minorHAnsi"/>
+        </w:rPr>
+        <w:t>–</w:t>
+      </w:r>
+      <w:r>
+        <w:rPr>
+          <w:rFonts w:asciiTheme="minorHAnsi" w:hAnsiTheme="minorHAnsi" w:cstheme="minorHAnsi"/>
+        </w:rPr>
+        <w:t xml:space="preserve"> </w:t>
+      </w:r>
+      <w:r>
+        <w:rPr>
+          <w:rFonts w:asciiTheme="minorHAnsi" w:hAnsiTheme="minorHAnsi" w:cstheme="minorHAnsi"/>
+        </w:rPr>
+        <w:t>Localização do empreendimento. Fonte: Google Earth, 2026</w:t>
+      </w:r>
+    </w:p>
+    <w:p>
+      <w:pPr>
+        <w:spacing w:before="240" w:after="240" w:line="360" w:lineRule="auto"/>
+        <w:ind w:firstLine="709"/>
+        <w:rPr>
+          <w:rFonts w:asciiTheme="minorHAnsi" w:hAnsiTheme="minorHAnsi" w:cstheme="minorHAnsi"/>
+        </w:rPr>
+      </w:pPr>
+      <w:r>
+        <w:rPr>
+          <w:rFonts w:asciiTheme="minorHAnsi" w:hAnsiTheme="minorHAnsi" w:cstheme="minorHAnsi"/>
+        </w:rPr>
+        <w:t>[[</w:t>
+      </w:r>
+      <w:r>
+        <w:rPr>
+          <w:rFonts w:asciiTheme="minorHAnsi" w:hAnsiTheme="minorHAnsi" w:cstheme="minorHAnsi"/>
+        </w:rPr>
+        <w:t>#</w:t>
+      </w:r>
+      <w:r>
+        <w:rPr>
+          <w:rFonts w:asciiTheme="minorHAnsi" w:hAnsiTheme="minorHAnsi" w:cstheme="minorHAnsi"/>
+        </w:rPr>
+        <w:t>motivacao]]</w:t>
+      </w:r>
+    </w:p>
+    <w:p>
+      <w:pPr>
+        <w:spacing w:before="240" w:after="240" w:line="360" w:lineRule="auto"/>
+        <w:ind w:firstLine="709"/>
+        <w:rPr>
+          <w:rFonts w:asciiTheme="minorHAnsi" w:hAnsiTheme="minorHAnsi" w:cstheme="minorHAnsi"/>
+        </w:rPr>
+      </w:pPr>
+      <w:r>
+        <w:rPr>
+          <w:rFonts w:asciiTheme="minorHAnsi" w:hAnsiTheme="minorHAnsi" w:cstheme="minorHAnsi"/>
+        </w:rPr>
+        <w:t>[[motivacao]]</w:t>
+      </w:r>
+    </w:p>
+    <w:p>
+      <w:pPr>
+        <w:spacing w:before="240" w:after="240" w:line="360" w:lineRule="auto"/>
+        <w:ind w:firstLine="709"/>
+        <w:rPr>
+          <w:rFonts w:asciiTheme="minorHAnsi" w:hAnsiTheme="minorHAnsi" w:cstheme="minorHAnsi"/>
+        </w:rPr>
+      </w:pPr>
+      <w:r>
+        <w:rPr>
+          <w:rFonts w:asciiTheme="minorHAnsi" w:hAnsiTheme="minorHAnsi" w:cstheme="minorHAnsi"/>
+        </w:rPr>
+        <w:t>[[/motivacao]]</w:t>
+      </w:r>
+    </w:p>
+    <w:p>
+      <w:pPr>
+        <w:spacing w:before="240" w:after="240" w:line="360" w:lineRule="auto"/>
+        <w:ind w:firstLine="709"/>
+        <w:rPr>
+          <w:rFonts w:asciiTheme="minorHAnsi" w:hAnsiTheme="minorHAnsi" w:cstheme="minorHAnsi"/>
+        </w:rPr>
+      </w:pPr>
+      <w:r>
+        <w:rPr>
+          <w:rFonts w:asciiTheme="minorHAnsi" w:hAnsiTheme="minorHAnsi" w:cstheme="minorHAnsi"/>
+        </w:rPr>
+        <w:t>[[#foto_geral]]</w:t>
+      </w:r>
+    </w:p>
+    <w:p>
+      <w:pPr>
+        <w:spacing w:before="240" w:after="240" w:line="360" w:lineRule="auto"/>
+        <w:ind w:firstLine="709"/>
+        <w:jc w:val="center"/>
+        <w:rPr>
+          <w:rFonts w:asciiTheme="minorHAnsi" w:hAnsiTheme="minorHAnsi" w:cstheme="minorHAnsi"/>
+        </w:rPr>
+      </w:pPr>
+      <w:r>
+        <w:rPr>
+          <w:rFonts w:asciiTheme="minorHAnsi" w:hAnsiTheme="minorHAnsi" w:cstheme="minorHAnsi"/>
+        </w:rPr>
+        <w:t>[[foto_geral</w:t>
+      </w:r>
+      <w:r>
+        <w:rPr>
+          <w:rFonts w:asciiTheme="minorHAnsi" w:hAnsiTheme="minorHAnsi" w:cstheme="minorHAnsi"/>
+        </w:rPr>
+        <w:t>_imagem</w:t>
+      </w:r>
+      <w:r>
+        <w:rPr>
+          <w:rFonts w:asciiTheme="minorHAnsi" w:hAnsiTheme="minorHAnsi" w:cstheme="minorHAnsi"/>
+        </w:rPr>
+        <w:t>]]</w:t>
+      </w:r>
+    </w:p>
+    <w:p>
+      <w:pPr>
+        <w:pStyle w:val="Legenda"/>
+        <w:jc w:val="center"/>
+        <w:rPr>
+          <w:rFonts w:asciiTheme="minorHAnsi" w:hAnsiTheme="minorHAnsi" w:cstheme="minorHAnsi"/>
+        </w:rPr>
+      </w:pPr>
+      <w:r>
+        <w:rPr>
+          <w:rFonts w:asciiTheme="minorHAnsi" w:hAnsiTheme="minorHAnsi" w:cstheme="minorHAnsi"/>
+        </w:rPr>
+        <w:t xml:space="preserve">Figura </w:t>
+      </w:r>
+      <w:r>
+        <w:rPr>
+          <w:rFonts w:asciiTheme="minorHAnsi" w:hAnsiTheme="minorHAnsi" w:cstheme="minorHAnsi"/>
+        </w:rPr>
+        <w:fldChar w:fldCharType="begin"/>
+      </w:r>
+      <w:r>
+        <w:rPr>
+          <w:rFonts w:asciiTheme="minorHAnsi" w:hAnsiTheme="minorHAnsi" w:cstheme="minorHAnsi"/>
+        </w:rPr>
+        <w:instrText xml:space="preserve"> SEQ Figura \* ARABIC </w:instrText>
+      </w:r>
+      <w:r>
+        <w:rPr>
+          <w:rFonts w:asciiTheme="minorHAnsi" w:hAnsiTheme="minorHAnsi" w:cstheme="minorHAnsi"/>
+        </w:rPr>
+        <w:fldChar w:fldCharType="separate"/>
+      </w:r>
+      <w:r>
+        <w:rPr>
+          <w:rFonts w:asciiTheme="minorHAnsi" w:hAnsiTheme="minorHAnsi" w:cstheme="minorHAnsi"/>
+          <w:noProof/>
+        </w:rPr>
+        <w:t>2</w:t>
+      </w:r>
+      <w:r>
+        <w:rPr>
+          <w:rFonts w:asciiTheme="minorHAnsi" w:hAnsiTheme="minorHAnsi" w:cstheme="minorHAnsi"/>
+        </w:rPr>
+        <w:fldChar w:fldCharType="end"/>
+      </w:r>
+      <w:r>
+        <w:rPr>
+          <w:rFonts w:asciiTheme="minorHAnsi" w:hAnsiTheme="minorHAnsi" w:cstheme="minorHAnsi"/>
+        </w:rPr>
+        <w:t xml:space="preserve"> </w:t>
+      </w:r>
+      <w:r>
+        <w:rPr>
+          <w:rFonts w:asciiTheme="minorHAnsi" w:hAnsiTheme="minorHAnsi" w:cstheme="minorHAnsi"/>
+        </w:rPr>
+        <w:t>–</w:t>
+      </w:r>
+      <w:r>
+        <w:rPr>
+          <w:rFonts w:asciiTheme="minorHAnsi" w:hAnsiTheme="minorHAnsi" w:cstheme="minorHAnsi"/>
+        </w:rPr>
+        <w:t xml:space="preserve"> </w:t>
+      </w:r>
+      <w:r>
+        <w:rPr>
+          <w:rFonts w:asciiTheme="minorHAnsi" w:hAnsiTheme="minorHAnsi" w:cstheme="minorHAnsi"/>
+        </w:rPr>
+        <w:t>Vista geral da estrutura ensaiada</w:t>
+      </w:r>
+    </w:p>
+    <w:p>
+      <w:pPr>
+        <w:spacing w:before="240" w:after="240" w:line="360" w:lineRule="auto"/>
+        <w:ind w:firstLine="709"/>
+        <w:rPr>
+          <w:rFonts w:asciiTheme="minorHAnsi" w:hAnsiTheme="minorHAnsi" w:cstheme="minorHAnsi"/>
+        </w:rPr>
+      </w:pPr>
+      <w:r>
+        <w:rPr>
+          <w:rFonts w:asciiTheme="minorHAnsi" w:hAnsiTheme="minorHAnsi" w:cstheme="minorHAnsi"/>
+        </w:rPr>
+        <w:t>[[/foto_geral]]</w:t>
       </w:r>
     </w:p>
     <w:p>
@@ -648,12 +1622,14 @@
           <w:rFonts w:asciiTheme="minorHAnsi" w:hAnsiTheme="minorHAnsi"/>
         </w:rPr>
       </w:pPr>
+      <w:bookmarkStart w:id="2" w:name="_Toc229498015"/>
       <w:r>
         <w:rPr>
           <w:rFonts w:asciiTheme="minorHAnsi" w:hAnsiTheme="minorHAnsi"/>
         </w:rPr>
-        <w:t>MODELO, TIPO E NÚMERO DE FABRIAÇÃO</w:t>
-      </w:r>
+        <w:t>METODOLOGIA DE ENSAIO</w:t>
+      </w:r>
+      <w:bookmarkEnd w:id="2"/>
     </w:p>
     <w:p>
       <w:pPr>
@@ -667,8 +1643,608 @@
         <w:rPr>
           <w:rFonts w:asciiTheme="minorHAnsi" w:hAnsiTheme="minorHAnsi" w:cstheme="minorHAnsi"/>
         </w:rPr>
-        <w:t>O esclerômetro utilizado é da marca Metrotokyo, modelo Tipo N, indicado para casos normais de edifícios, pontes, postes, etc.</w:t>
-      </w:r>
+        <w:t>O esclerômetro utilizado é da marca Metrotokyo (</w:t>
+      </w:r>
+      <w:r>
+        <w:rPr>
+          <w:rFonts w:asciiTheme="minorHAnsi" w:hAnsiTheme="minorHAnsi" w:cstheme="minorHAnsi"/>
+        </w:rPr>
+        <w:fldChar w:fldCharType="begin"/>
+      </w:r>
+      <w:r>
+        <w:rPr>
+          <w:rFonts w:asciiTheme="minorHAnsi" w:hAnsiTheme="minorHAnsi" w:cstheme="minorHAnsi"/>
+        </w:rPr>
+        <w:instrText xml:space="preserve"> REF _Ref229495349 \h </w:instrText>
+      </w:r>
+      <w:r>
+        <w:rPr>
+          <w:rFonts w:asciiTheme="minorHAnsi" w:hAnsiTheme="minorHAnsi" w:cstheme="minorHAnsi"/>
+        </w:rPr>
+      </w:r>
+      <w:r>
+        <w:rPr>
+          <w:rFonts w:asciiTheme="minorHAnsi" w:hAnsiTheme="minorHAnsi" w:cstheme="minorHAnsi"/>
+        </w:rPr>
+        <w:fldChar w:fldCharType="separate"/>
+      </w:r>
+      <w:r>
+        <w:rPr>
+          <w:rFonts w:asciiTheme="minorHAnsi" w:hAnsiTheme="minorHAnsi" w:cstheme="minorHAnsi"/>
+        </w:rPr>
+        <w:t xml:space="preserve">Figura </w:t>
+      </w:r>
+      <w:r>
+        <w:rPr>
+          <w:rFonts w:asciiTheme="minorHAnsi" w:hAnsiTheme="minorHAnsi" w:cstheme="minorHAnsi"/>
+          <w:noProof/>
+        </w:rPr>
+        <w:t>3</w:t>
+      </w:r>
+      <w:r>
+        <w:rPr>
+          <w:rFonts w:asciiTheme="minorHAnsi" w:hAnsiTheme="minorHAnsi" w:cstheme="minorHAnsi"/>
+        </w:rPr>
+        <w:fldChar w:fldCharType="end"/>
+      </w:r>
+      <w:r>
+        <w:rPr>
+          <w:rFonts w:asciiTheme="minorHAnsi" w:hAnsiTheme="minorHAnsi" w:cstheme="minorHAnsi"/>
+        </w:rPr>
+        <w:t>), modelo Tipo N, indicado para casos normais de edifícios, pontes, postes, etc. A norma de referência para esse ensaio é a NBR 7584:2012 - concreto endurecido - avaliação da dureza superficial pelo esclerômetro de reflexão - método de ensaio.</w:t>
+      </w:r>
+    </w:p>
+    <w:tbl>
+      <w:tblPr>
+        <w:tblStyle w:val="Tabelacomgrade"/>
+        <w:tblW w:w="0" w:type="auto"/>
+        <w:jc w:val="center"/>
+        <w:tblBorders>
+          <w:top w:val="none" w:sz="0" w:space="0" w:color="auto"/>
+          <w:left w:val="none" w:sz="0" w:space="0" w:color="auto"/>
+          <w:bottom w:val="none" w:sz="0" w:space="0" w:color="auto"/>
+          <w:right w:val="none" w:sz="0" w:space="0" w:color="auto"/>
+          <w:insideH w:val="none" w:sz="0" w:space="0" w:color="auto"/>
+          <w:insideV w:val="none" w:sz="0" w:space="0" w:color="auto"/>
+        </w:tblBorders>
+        <w:tblLook w:val="04A0" w:firstRow="1" w:lastRow="0" w:firstColumn="1" w:lastColumn="0" w:noHBand="0" w:noVBand="1"/>
+      </w:tblPr>
+      <w:tblGrid>
+        <w:gridCol w:w="7512"/>
+      </w:tblGrid>
+      <w:tr>
+        <w:trPr>
+          <w:jc w:val="center"/>
+        </w:trPr>
+        <w:tc>
+          <w:tcPr>
+            <w:tcW w:w="7512" w:type="dxa"/>
+          </w:tcPr>
+          <w:p>
+            <w:pPr>
+              <w:keepNext/>
+              <w:spacing w:line="360" w:lineRule="auto"/>
+              <w:jc w:val="center"/>
+            </w:pPr>
+            <w:r>
+              <w:rPr>
+                <w:rFonts w:asciiTheme="minorHAnsi" w:hAnsiTheme="minorHAnsi" w:cstheme="minorHAnsi"/>
+                <w:noProof/>
+                <w:lang w:eastAsia="pt-BR"/>
+              </w:rPr>
+              <w:lastRenderedPageBreak/>
+              <w:drawing>
+                <wp:inline distT="0" distB="0" distL="0" distR="0" wp14:anchorId="0B35ECC3" wp14:editId="26E9C510">
+                  <wp:extent cx="3152053" cy="1911350"/>
+                  <wp:effectExtent l="0" t="0" r="0" b="0"/>
+                  <wp:docPr id="34" name="Imagem 34" descr="Em preto e branco"/>
+                  <wp:cNvGraphicFramePr>
+                    <a:graphicFrameLocks xmlns:a="http://schemas.openxmlformats.org/drawingml/2006/main" noChangeAspect="1"/>
+                  </wp:cNvGraphicFramePr>
+                  <a:graphic xmlns:a="http://schemas.openxmlformats.org/drawingml/2006/main">
+                    <a:graphicData uri="http://schemas.openxmlformats.org/drawingml/2006/picture">
+                      <pic:pic xmlns:pic="http://schemas.openxmlformats.org/drawingml/2006/picture">
+                        <pic:nvPicPr>
+                          <pic:cNvPr id="34" name="Imagem 34" descr="Em preto e branco"/>
+                          <pic:cNvPicPr/>
+                        </pic:nvPicPr>
+                        <pic:blipFill>
+                          <a:blip r:embed="rId10"/>
+                          <a:stretch>
+                            <a:fillRect/>
+                          </a:stretch>
+                        </pic:blipFill>
+                        <pic:spPr>
+                          <a:xfrm>
+                            <a:off x="0" y="0"/>
+                            <a:ext cx="3221903" cy="1953706"/>
+                          </a:xfrm>
+                          <a:prstGeom prst="rect">
+                            <a:avLst/>
+                          </a:prstGeom>
+                        </pic:spPr>
+                      </pic:pic>
+                    </a:graphicData>
+                  </a:graphic>
+                </wp:inline>
+              </w:drawing>
+            </w:r>
+          </w:p>
+          <w:p>
+            <w:pPr>
+              <w:pStyle w:val="Legenda"/>
+              <w:jc w:val="center"/>
+              <w:rPr>
+                <w:rFonts w:asciiTheme="minorHAnsi" w:hAnsiTheme="minorHAnsi" w:cstheme="minorHAnsi"/>
+              </w:rPr>
+            </w:pPr>
+            <w:bookmarkStart w:id="3" w:name="_Ref229495349"/>
+            <w:bookmarkStart w:id="4" w:name="_Ref229495343"/>
+            <w:r>
+              <w:rPr>
+                <w:rFonts w:asciiTheme="minorHAnsi" w:hAnsiTheme="minorHAnsi" w:cstheme="minorHAnsi"/>
+              </w:rPr>
+              <w:t xml:space="preserve">Figura </w:t>
+            </w:r>
+            <w:r>
+              <w:rPr>
+                <w:rFonts w:asciiTheme="minorHAnsi" w:hAnsiTheme="minorHAnsi" w:cstheme="minorHAnsi"/>
+              </w:rPr>
+              <w:fldChar w:fldCharType="begin"/>
+            </w:r>
+            <w:r>
+              <w:rPr>
+                <w:rFonts w:asciiTheme="minorHAnsi" w:hAnsiTheme="minorHAnsi" w:cstheme="minorHAnsi"/>
+              </w:rPr>
+              <w:instrText xml:space="preserve"> SEQ Figura \* ARABIC </w:instrText>
+            </w:r>
+            <w:r>
+              <w:rPr>
+                <w:rFonts w:asciiTheme="minorHAnsi" w:hAnsiTheme="minorHAnsi" w:cstheme="minorHAnsi"/>
+              </w:rPr>
+              <w:fldChar w:fldCharType="separate"/>
+            </w:r>
+            <w:r>
+              <w:rPr>
+                <w:rFonts w:asciiTheme="minorHAnsi" w:hAnsiTheme="minorHAnsi" w:cstheme="minorHAnsi"/>
+                <w:noProof/>
+              </w:rPr>
+              <w:t>3</w:t>
+            </w:r>
+            <w:r>
+              <w:rPr>
+                <w:rFonts w:asciiTheme="minorHAnsi" w:hAnsiTheme="minorHAnsi" w:cstheme="minorHAnsi"/>
+              </w:rPr>
+              <w:fldChar w:fldCharType="end"/>
+            </w:r>
+            <w:bookmarkEnd w:id="3"/>
+            <w:r>
+              <w:rPr>
+                <w:rFonts w:asciiTheme="minorHAnsi" w:hAnsiTheme="minorHAnsi" w:cstheme="minorHAnsi"/>
+              </w:rPr>
+              <w:t xml:space="preserve"> - Representação do equipamento utilizado</w:t>
+            </w:r>
+            <w:bookmarkEnd w:id="4"/>
+          </w:p>
+        </w:tc>
+      </w:tr>
+    </w:tbl>
+    <w:p>
+      <w:pPr>
+        <w:spacing w:before="240" w:after="240" w:line="360" w:lineRule="auto"/>
+        <w:ind w:firstLine="851"/>
+        <w:jc w:val="both"/>
+        <w:rPr>
+          <w:rFonts w:asciiTheme="minorHAnsi" w:hAnsiTheme="minorHAnsi" w:cstheme="minorHAnsi"/>
+        </w:rPr>
+      </w:pPr>
+      <w:r>
+        <w:rPr>
+          <w:rFonts w:asciiTheme="minorHAnsi" w:hAnsiTheme="minorHAnsi" w:cstheme="minorHAnsi"/>
+        </w:rPr>
+        <w:t xml:space="preserve">A metodologia do ensaio atende as recomendações descritas na NBR 7584:2012. Neste ensaio foram realizados 16 impactos em cada região analisada, dispostos em malhas conforme a </w:t>
+      </w:r>
+      <w:r>
+        <w:rPr>
+          <w:rFonts w:asciiTheme="minorHAnsi" w:hAnsiTheme="minorHAnsi" w:cstheme="minorHAnsi"/>
+        </w:rPr>
+        <w:fldChar w:fldCharType="begin"/>
+      </w:r>
+      <w:r>
+        <w:rPr>
+          <w:rFonts w:asciiTheme="minorHAnsi" w:hAnsiTheme="minorHAnsi" w:cstheme="minorHAnsi"/>
+        </w:rPr>
+        <w:instrText xml:space="preserve"> REF _Ref229495461 \h </w:instrText>
+      </w:r>
+      <w:r>
+        <w:rPr>
+          <w:rFonts w:asciiTheme="minorHAnsi" w:hAnsiTheme="minorHAnsi" w:cstheme="minorHAnsi"/>
+        </w:rPr>
+      </w:r>
+      <w:r>
+        <w:rPr>
+          <w:rFonts w:asciiTheme="minorHAnsi" w:hAnsiTheme="minorHAnsi" w:cstheme="minorHAnsi"/>
+        </w:rPr>
+        <w:fldChar w:fldCharType="separate"/>
+      </w:r>
+      <w:r>
+        <w:rPr>
+          <w:rFonts w:asciiTheme="minorHAnsi" w:hAnsiTheme="minorHAnsi" w:cstheme="minorHAnsi"/>
+        </w:rPr>
+        <w:t xml:space="preserve">Figura </w:t>
+      </w:r>
+      <w:r>
+        <w:rPr>
+          <w:rFonts w:asciiTheme="minorHAnsi" w:hAnsiTheme="minorHAnsi" w:cstheme="minorHAnsi"/>
+          <w:noProof/>
+        </w:rPr>
+        <w:t>4</w:t>
+      </w:r>
+      <w:r>
+        <w:rPr>
+          <w:rFonts w:asciiTheme="minorHAnsi" w:hAnsiTheme="minorHAnsi" w:cstheme="minorHAnsi"/>
+        </w:rPr>
+        <w:fldChar w:fldCharType="end"/>
+      </w:r>
+      <w:r>
+        <w:rPr>
+          <w:rFonts w:asciiTheme="minorHAnsi" w:hAnsiTheme="minorHAnsi" w:cstheme="minorHAnsi"/>
+        </w:rPr>
+        <w:t>.</w:t>
+      </w:r>
+      <w:r>
+        <w:rPr>
+          <w:rFonts w:asciiTheme="minorHAnsi" w:hAnsiTheme="minorHAnsi" w:cstheme="minorHAnsi"/>
+        </w:rPr>
+        <w:t xml:space="preserve"> </w:t>
+      </w:r>
+      <w:r>
+        <w:rPr>
+          <w:rFonts w:asciiTheme="minorHAnsi" w:hAnsiTheme="minorHAnsi" w:cstheme="minorHAnsi"/>
+        </w:rPr>
+        <w:t>Sabendo da heterogeneidade do concreto, fazendo com que os valores dos impactos sejam variáveis, se faz necessário que os resultados sejam filtrados, de modo que</w:t>
+      </w:r>
+      <w:r>
+        <w:rPr>
+          <w:rFonts w:asciiTheme="minorHAnsi" w:hAnsiTheme="minorHAnsi" w:cstheme="minorHAnsi"/>
+        </w:rPr>
+        <w:t>,</w:t>
+      </w:r>
+      <w:r>
+        <w:rPr>
+          <w:rFonts w:asciiTheme="minorHAnsi" w:hAnsiTheme="minorHAnsi" w:cstheme="minorHAnsi"/>
+        </w:rPr>
+        <w:t xml:space="preserve"> valores que </w:t>
+      </w:r>
+      <w:r>
+        <w:rPr>
+          <w:rFonts w:asciiTheme="minorHAnsi" w:hAnsiTheme="minorHAnsi" w:cstheme="minorHAnsi"/>
+        </w:rPr>
+        <w:t xml:space="preserve">se </w:t>
+      </w:r>
+      <w:r>
+        <w:rPr>
+          <w:rFonts w:asciiTheme="minorHAnsi" w:hAnsiTheme="minorHAnsi" w:cstheme="minorHAnsi"/>
+        </w:rPr>
+        <w:t>distanciam da média não são levados em consideração.</w:t>
+      </w:r>
+    </w:p>
+    <w:p>
+      <w:pPr>
+        <w:keepNext/>
+        <w:spacing w:before="240" w:after="240" w:line="360" w:lineRule="auto"/>
+        <w:jc w:val="center"/>
+      </w:pPr>
+      <w:r>
+        <w:rPr>
+          <w:rFonts w:asciiTheme="minorHAnsi" w:hAnsiTheme="minorHAnsi"/>
+          <w:noProof/>
+        </w:rPr>
+        <w:drawing>
+          <wp:inline distT="0" distB="0" distL="0" distR="0" wp14:anchorId="250CFA59" wp14:editId="1F0EB99D">
+            <wp:extent cx="2389224" cy="2160000"/>
+            <wp:effectExtent l="0" t="0" r="0" b="0"/>
+            <wp:docPr id="4" name="Imagem 4" descr="Forma&#10;&#10;O conteúdo gerado por IA pode estar incorreto."/>
+            <wp:cNvGraphicFramePr>
+              <a:graphicFrameLocks xmlns:a="http://schemas.openxmlformats.org/drawingml/2006/main" noChangeAspect="1"/>
+            </wp:cNvGraphicFramePr>
+            <a:graphic xmlns:a="http://schemas.openxmlformats.org/drawingml/2006/main">
+              <a:graphicData uri="http://schemas.openxmlformats.org/drawingml/2006/picture">
+                <pic:pic xmlns:pic="http://schemas.openxmlformats.org/drawingml/2006/picture">
+                  <pic:nvPicPr>
+                    <pic:cNvPr id="4" name="Imagem 4" descr="Forma&#10;&#10;O conteúdo gerado por IA pode estar incorreto."/>
+                    <pic:cNvPicPr/>
+                  </pic:nvPicPr>
+                  <pic:blipFill>
+                    <a:blip r:embed="rId11"/>
+                    <a:stretch>
+                      <a:fillRect/>
+                    </a:stretch>
+                  </pic:blipFill>
+                  <pic:spPr>
+                    <a:xfrm>
+                      <a:off x="0" y="0"/>
+                      <a:ext cx="2389224" cy="2160000"/>
+                    </a:xfrm>
+                    <a:prstGeom prst="rect">
+                      <a:avLst/>
+                    </a:prstGeom>
+                  </pic:spPr>
+                </pic:pic>
+              </a:graphicData>
+            </a:graphic>
+          </wp:inline>
+        </w:drawing>
+      </w:r>
+    </w:p>
+    <w:p>
+      <w:pPr>
+        <w:pStyle w:val="Legenda"/>
+        <w:jc w:val="center"/>
+        <w:rPr>
+          <w:rFonts w:asciiTheme="minorHAnsi" w:hAnsiTheme="minorHAnsi" w:cstheme="minorHAnsi"/>
+        </w:rPr>
+      </w:pPr>
+      <w:bookmarkStart w:id="5" w:name="_Ref229495461"/>
+      <w:r>
+        <w:rPr>
+          <w:rFonts w:asciiTheme="minorHAnsi" w:hAnsiTheme="minorHAnsi" w:cstheme="minorHAnsi"/>
+        </w:rPr>
+        <w:t xml:space="preserve">Figura </w:t>
+      </w:r>
+      <w:r>
+        <w:rPr>
+          <w:rFonts w:asciiTheme="minorHAnsi" w:hAnsiTheme="minorHAnsi" w:cstheme="minorHAnsi"/>
+        </w:rPr>
+        <w:fldChar w:fldCharType="begin"/>
+      </w:r>
+      <w:r>
+        <w:rPr>
+          <w:rFonts w:asciiTheme="minorHAnsi" w:hAnsiTheme="minorHAnsi" w:cstheme="minorHAnsi"/>
+        </w:rPr>
+        <w:instrText xml:space="preserve"> SEQ Figura \* ARABIC </w:instrText>
+      </w:r>
+      <w:r>
+        <w:rPr>
+          <w:rFonts w:asciiTheme="minorHAnsi" w:hAnsiTheme="minorHAnsi" w:cstheme="minorHAnsi"/>
+        </w:rPr>
+        <w:fldChar w:fldCharType="separate"/>
+      </w:r>
+      <w:r>
+        <w:rPr>
+          <w:rFonts w:asciiTheme="minorHAnsi" w:hAnsiTheme="minorHAnsi" w:cstheme="minorHAnsi"/>
+          <w:noProof/>
+        </w:rPr>
+        <w:t>4</w:t>
+      </w:r>
+      <w:r>
+        <w:rPr>
+          <w:rFonts w:asciiTheme="minorHAnsi" w:hAnsiTheme="minorHAnsi" w:cstheme="minorHAnsi"/>
+        </w:rPr>
+        <w:fldChar w:fldCharType="end"/>
+      </w:r>
+      <w:bookmarkEnd w:id="5"/>
+      <w:r>
+        <w:rPr>
+          <w:rFonts w:asciiTheme="minorHAnsi" w:hAnsiTheme="minorHAnsi" w:cstheme="minorHAnsi"/>
+        </w:rPr>
+        <w:t xml:space="preserve"> - Croqui com indicação da malha utilizada para o ensaio</w:t>
+      </w:r>
+    </w:p>
+    <w:p>
+      <w:pPr>
+        <w:spacing w:before="240" w:after="240" w:line="360" w:lineRule="auto"/>
+        <w:ind w:firstLine="851"/>
+        <w:jc w:val="both"/>
+        <w:rPr>
+          <w:rFonts w:asciiTheme="minorHAnsi" w:hAnsiTheme="minorHAnsi" w:cstheme="minorHAnsi"/>
+        </w:rPr>
+      </w:pPr>
+      <w:r>
+        <w:rPr>
+          <w:rFonts w:asciiTheme="minorHAnsi" w:hAnsiTheme="minorHAnsi" w:cstheme="minorHAnsi"/>
+        </w:rPr>
+        <w:t>O método avalia a dureza superficial do concreto endurecido e permite estimar, através de equações estabelecidas em norma, o valor de resistência a compressão axial do concreto do elemento estrutural ensaiado.</w:t>
+      </w:r>
+    </w:p>
+    <w:p>
+      <w:pPr>
+        <w:spacing w:before="240" w:after="240" w:line="360" w:lineRule="auto"/>
+        <w:ind w:firstLine="851"/>
+        <w:jc w:val="both"/>
+        <w:rPr>
+          <w:rFonts w:asciiTheme="minorHAnsi" w:hAnsiTheme="minorHAnsi" w:cstheme="minorHAnsi"/>
+        </w:rPr>
+      </w:pPr>
+      <w:r>
+        <w:rPr>
+          <w:rFonts w:asciiTheme="minorHAnsi" w:hAnsiTheme="minorHAnsi" w:cstheme="minorHAnsi"/>
+        </w:rPr>
+        <w:t xml:space="preserve">[[#croqui]]A seguir será apresentada na </w:t>
+      </w:r>
+      <w:r>
+        <w:rPr>
+          <w:rFonts w:asciiTheme="minorHAnsi" w:hAnsiTheme="minorHAnsi" w:cstheme="minorHAnsi"/>
+        </w:rPr>
+        <w:fldChar w:fldCharType="begin"/>
+      </w:r>
+      <w:r>
+        <w:rPr>
+          <w:rFonts w:asciiTheme="minorHAnsi" w:hAnsiTheme="minorHAnsi" w:cstheme="minorHAnsi"/>
+        </w:rPr>
+        <w:instrText xml:space="preserve"> REF _Ref229497914 \h </w:instrText>
+      </w:r>
+      <w:r>
+        <w:rPr>
+          <w:rFonts w:asciiTheme="minorHAnsi" w:hAnsiTheme="minorHAnsi" w:cstheme="minorHAnsi"/>
+        </w:rPr>
+      </w:r>
+      <w:r>
+        <w:rPr>
+          <w:rFonts w:asciiTheme="minorHAnsi" w:hAnsiTheme="minorHAnsi" w:cstheme="minorHAnsi"/>
+        </w:rPr>
+        <w:fldChar w:fldCharType="separate"/>
+      </w:r>
+      <w:r>
+        <w:rPr>
+          <w:rFonts w:asciiTheme="minorHAnsi" w:hAnsiTheme="minorHAnsi" w:cstheme="minorHAnsi"/>
+        </w:rPr>
+        <w:t xml:space="preserve">Figura </w:t>
+      </w:r>
+      <w:r>
+        <w:rPr>
+          <w:rFonts w:asciiTheme="minorHAnsi" w:hAnsiTheme="minorHAnsi" w:cstheme="minorHAnsi"/>
+          <w:noProof/>
+        </w:rPr>
+        <w:t>5</w:t>
+      </w:r>
+      <w:r>
+        <w:rPr>
+          <w:rFonts w:asciiTheme="minorHAnsi" w:hAnsiTheme="minorHAnsi" w:cstheme="minorHAnsi"/>
+        </w:rPr>
+        <w:fldChar w:fldCharType="end"/>
+      </w:r>
+      <w:r>
+        <w:rPr>
+          <w:rFonts w:asciiTheme="minorHAnsi" w:hAnsiTheme="minorHAnsi" w:cstheme="minorHAnsi"/>
+        </w:rPr>
+        <w:t xml:space="preserve"> um croqui com indicação dos elementos ensaiados que foram nomeadas “</w:t>
+      </w:r>
+      <w:r>
+        <w:rPr>
+          <w:rFonts w:asciiTheme="minorHAnsi" w:hAnsiTheme="minorHAnsi" w:cstheme="minorHAnsi"/>
+          <w:i/>
+          <w:iCs/>
+        </w:rPr>
+        <w:t>in loco</w:t>
+      </w:r>
+      <w:r>
+        <w:rPr>
+          <w:rFonts w:asciiTheme="minorHAnsi" w:hAnsiTheme="minorHAnsi" w:cstheme="minorHAnsi"/>
+        </w:rPr>
+        <w:t>”, a partir da ordem de execução do ensaio.</w:t>
+      </w:r>
+    </w:p>
+    <w:p>
+      <w:pPr>
+        <w:pStyle w:val="Legenda"/>
+        <w:jc w:val="center"/>
+        <w:rPr>
+          <w:rFonts w:asciiTheme="minorHAnsi" w:hAnsiTheme="minorHAnsi" w:cstheme="minorHAnsi"/>
+          <w:b w:val="0"/>
+          <w:bCs w:val="0"/>
+          <w:sz w:val="24"/>
+          <w:lang w:eastAsia="en-US"/>
+        </w:rPr>
+      </w:pPr>
+      <w:bookmarkStart w:id="6" w:name="_Ref229495662"/>
+      <w:r>
+        <w:rPr>
+          <w:rFonts w:asciiTheme="minorHAnsi" w:hAnsiTheme="minorHAnsi" w:cstheme="minorHAnsi"/>
+          <w:b w:val="0"/>
+          <w:bCs w:val="0"/>
+          <w:sz w:val="24"/>
+          <w:lang w:eastAsia="en-US"/>
+        </w:rPr>
+        <w:t>[[croqui_imagem]]</w:t>
+      </w:r>
+    </w:p>
+    <w:p>
+      <w:pPr>
+        <w:pStyle w:val="Legenda"/>
+        <w:jc w:val="center"/>
+        <w:rPr>
+          <w:rFonts w:asciiTheme="minorHAnsi" w:hAnsiTheme="minorHAnsi" w:cstheme="minorHAnsi"/>
+        </w:rPr>
+      </w:pPr>
+      <w:bookmarkStart w:id="7" w:name="_Ref229497914"/>
+      <w:r>
+        <w:rPr>
+          <w:rFonts w:asciiTheme="minorHAnsi" w:hAnsiTheme="minorHAnsi" w:cstheme="minorHAnsi"/>
+        </w:rPr>
+        <w:lastRenderedPageBreak/>
+        <w:t xml:space="preserve">Figura </w:t>
+      </w:r>
+      <w:r>
+        <w:rPr>
+          <w:rFonts w:asciiTheme="minorHAnsi" w:hAnsiTheme="minorHAnsi" w:cstheme="minorHAnsi"/>
+        </w:rPr>
+        <w:fldChar w:fldCharType="begin"/>
+      </w:r>
+      <w:r>
+        <w:rPr>
+          <w:rFonts w:asciiTheme="minorHAnsi" w:hAnsiTheme="minorHAnsi" w:cstheme="minorHAnsi"/>
+        </w:rPr>
+        <w:instrText xml:space="preserve"> SEQ Figura \* ARABIC </w:instrText>
+      </w:r>
+      <w:r>
+        <w:rPr>
+          <w:rFonts w:asciiTheme="minorHAnsi" w:hAnsiTheme="minorHAnsi" w:cstheme="minorHAnsi"/>
+        </w:rPr>
+        <w:fldChar w:fldCharType="separate"/>
+      </w:r>
+      <w:r>
+        <w:rPr>
+          <w:rFonts w:asciiTheme="minorHAnsi" w:hAnsiTheme="minorHAnsi" w:cstheme="minorHAnsi"/>
+          <w:noProof/>
+        </w:rPr>
+        <w:t>5</w:t>
+      </w:r>
+      <w:r>
+        <w:rPr>
+          <w:rFonts w:asciiTheme="minorHAnsi" w:hAnsiTheme="minorHAnsi" w:cstheme="minorHAnsi"/>
+        </w:rPr>
+        <w:fldChar w:fldCharType="end"/>
+      </w:r>
+      <w:bookmarkEnd w:id="6"/>
+      <w:bookmarkEnd w:id="7"/>
+      <w:r>
+        <w:rPr>
+          <w:rFonts w:asciiTheme="minorHAnsi" w:hAnsiTheme="minorHAnsi" w:cstheme="minorHAnsi"/>
+        </w:rPr>
+        <w:t xml:space="preserve"> </w:t>
+      </w:r>
+      <w:r>
+        <w:rPr>
+          <w:rFonts w:asciiTheme="minorHAnsi" w:hAnsiTheme="minorHAnsi" w:cstheme="minorHAnsi"/>
+        </w:rPr>
+        <w:t>–</w:t>
+      </w:r>
+      <w:r>
+        <w:rPr>
+          <w:rFonts w:asciiTheme="minorHAnsi" w:hAnsiTheme="minorHAnsi" w:cstheme="minorHAnsi"/>
+        </w:rPr>
+        <w:t xml:space="preserve"> </w:t>
+      </w:r>
+      <w:r>
+        <w:rPr>
+          <w:rFonts w:asciiTheme="minorHAnsi" w:hAnsiTheme="minorHAnsi" w:cstheme="minorHAnsi"/>
+        </w:rPr>
+        <w:t>Indicação dos elementos ensaiados</w:t>
+      </w:r>
+    </w:p>
+    <w:p>
+      <w:pPr>
+        <w:rPr>
+          <w:rFonts w:asciiTheme="minorHAnsi" w:hAnsiTheme="minorHAnsi" w:cstheme="minorHAnsi"/>
+          <w:lang w:eastAsia="pt-BR"/>
+        </w:rPr>
+      </w:pPr>
+      <w:r>
+        <w:rPr>
+          <w:rFonts w:asciiTheme="minorHAnsi" w:hAnsiTheme="minorHAnsi" w:cstheme="minorHAnsi"/>
+          <w:lang w:eastAsia="pt-BR"/>
+        </w:rPr>
+        <w:t>[[/croqui]]</w:t>
+      </w:r>
+    </w:p>
+    <w:p>
+      <w:pPr>
+        <w:rPr>
+          <w:rFonts w:asciiTheme="minorHAnsi" w:hAnsiTheme="minorHAnsi" w:cstheme="minorHAnsi"/>
+          <w:lang w:eastAsia="pt-BR"/>
+        </w:rPr>
+      </w:pPr>
     </w:p>
     <w:p>
       <w:pPr>
@@ -683,12 +2259,14 @@
           <w:rFonts w:asciiTheme="minorHAnsi" w:hAnsiTheme="minorHAnsi"/>
         </w:rPr>
       </w:pPr>
+      <w:bookmarkStart w:id="8" w:name="_Toc229498016"/>
       <w:r>
         <w:rPr>
           <w:rFonts w:asciiTheme="minorHAnsi" w:hAnsiTheme="minorHAnsi"/>
         </w:rPr>
         <w:t>ÍNDICE ESCLEROMÉTRICO DA VERIFICAÇÃO DO APARELHO</w:t>
       </w:r>
+      <w:bookmarkEnd w:id="8"/>
     </w:p>
     <w:tbl>
       <w:tblPr>
@@ -731,8 +2309,8 @@
                 <w:rFonts w:asciiTheme="minorHAnsi" w:hAnsiTheme="minorHAnsi" w:cstheme="minorHAnsi"/>
                 <w:b/>
                 <w:bCs/>
-                <w:sz w:val="22"/>
-                <w:szCs w:val="18"/>
+                <w:sz w:val="20"/>
+                <w:szCs w:val="16"/>
               </w:rPr>
             </w:pPr>
             <w:r>
@@ -740,8 +2318,8 @@
                 <w:rFonts w:asciiTheme="minorHAnsi" w:hAnsiTheme="minorHAnsi" w:cstheme="minorHAnsi"/>
                 <w:b/>
                 <w:bCs/>
-                <w:sz w:val="22"/>
-                <w:szCs w:val="18"/>
+                <w:sz w:val="20"/>
+                <w:szCs w:val="16"/>
               </w:rPr>
               <w:t>GOLPE</w:t>
             </w:r>
@@ -760,8 +2338,8 @@
                 <w:rFonts w:asciiTheme="minorHAnsi" w:hAnsiTheme="minorHAnsi" w:cstheme="minorHAnsi"/>
                 <w:b/>
                 <w:bCs/>
-                <w:sz w:val="22"/>
-                <w:szCs w:val="18"/>
+                <w:sz w:val="20"/>
+                <w:szCs w:val="16"/>
               </w:rPr>
             </w:pPr>
             <w:r>
@@ -769,8 +2347,8 @@
                 <w:rFonts w:asciiTheme="minorHAnsi" w:hAnsiTheme="minorHAnsi" w:cstheme="minorHAnsi"/>
                 <w:b/>
                 <w:bCs/>
-                <w:sz w:val="22"/>
-                <w:szCs w:val="18"/>
+                <w:sz w:val="20"/>
+                <w:szCs w:val="16"/>
               </w:rPr>
               <w:t>1º</w:t>
             </w:r>
@@ -788,8 +2366,8 @@
                 <w:rFonts w:asciiTheme="minorHAnsi" w:hAnsiTheme="minorHAnsi" w:cstheme="minorHAnsi"/>
                 <w:b/>
                 <w:bCs/>
-                <w:sz w:val="22"/>
-                <w:szCs w:val="18"/>
+                <w:sz w:val="20"/>
+                <w:szCs w:val="16"/>
               </w:rPr>
             </w:pPr>
             <w:r>
@@ -797,8 +2375,8 @@
                 <w:rFonts w:asciiTheme="minorHAnsi" w:hAnsiTheme="minorHAnsi" w:cstheme="minorHAnsi"/>
                 <w:b/>
                 <w:bCs/>
-                <w:sz w:val="22"/>
-                <w:szCs w:val="18"/>
+                <w:sz w:val="20"/>
+                <w:szCs w:val="16"/>
               </w:rPr>
               <w:t>2º</w:t>
             </w:r>
@@ -817,8 +2395,8 @@
                 <w:rFonts w:asciiTheme="minorHAnsi" w:hAnsiTheme="minorHAnsi" w:cstheme="minorHAnsi"/>
                 <w:b/>
                 <w:bCs/>
-                <w:sz w:val="22"/>
-                <w:szCs w:val="18"/>
+                <w:sz w:val="20"/>
+                <w:szCs w:val="16"/>
               </w:rPr>
             </w:pPr>
             <w:r>
@@ -826,8 +2404,8 @@
                 <w:rFonts w:asciiTheme="minorHAnsi" w:hAnsiTheme="minorHAnsi" w:cstheme="minorHAnsi"/>
                 <w:b/>
                 <w:bCs/>
-                <w:sz w:val="22"/>
-                <w:szCs w:val="18"/>
+                <w:sz w:val="20"/>
+                <w:szCs w:val="16"/>
               </w:rPr>
               <w:t>3º</w:t>
             </w:r>
@@ -845,8 +2423,8 @@
                 <w:rFonts w:asciiTheme="minorHAnsi" w:hAnsiTheme="minorHAnsi" w:cstheme="minorHAnsi"/>
                 <w:b/>
                 <w:bCs/>
-                <w:sz w:val="22"/>
-                <w:szCs w:val="18"/>
+                <w:sz w:val="20"/>
+                <w:szCs w:val="16"/>
               </w:rPr>
             </w:pPr>
             <w:r>
@@ -854,8 +2432,8 @@
                 <w:rFonts w:asciiTheme="minorHAnsi" w:hAnsiTheme="minorHAnsi" w:cstheme="minorHAnsi"/>
                 <w:b/>
                 <w:bCs/>
-                <w:sz w:val="22"/>
-                <w:szCs w:val="18"/>
+                <w:sz w:val="20"/>
+                <w:szCs w:val="16"/>
               </w:rPr>
               <w:t>4º</w:t>
             </w:r>
@@ -874,8 +2452,8 @@
                 <w:rFonts w:asciiTheme="minorHAnsi" w:hAnsiTheme="minorHAnsi" w:cstheme="minorHAnsi"/>
                 <w:b/>
                 <w:bCs/>
-                <w:sz w:val="22"/>
-                <w:szCs w:val="18"/>
+                <w:sz w:val="20"/>
+                <w:szCs w:val="16"/>
               </w:rPr>
             </w:pPr>
             <w:r>
@@ -883,8 +2461,8 @@
                 <w:rFonts w:asciiTheme="minorHAnsi" w:hAnsiTheme="minorHAnsi" w:cstheme="minorHAnsi"/>
                 <w:b/>
                 <w:bCs/>
-                <w:sz w:val="22"/>
-                <w:szCs w:val="18"/>
+                <w:sz w:val="20"/>
+                <w:szCs w:val="16"/>
               </w:rPr>
               <w:t>5º</w:t>
             </w:r>
@@ -903,8 +2481,8 @@
                 <w:rFonts w:asciiTheme="minorHAnsi" w:hAnsiTheme="minorHAnsi" w:cstheme="minorHAnsi"/>
                 <w:b/>
                 <w:bCs/>
-                <w:sz w:val="22"/>
-                <w:szCs w:val="18"/>
+                <w:sz w:val="20"/>
+                <w:szCs w:val="16"/>
               </w:rPr>
             </w:pPr>
             <w:r>
@@ -912,8 +2490,8 @@
                 <w:rFonts w:asciiTheme="minorHAnsi" w:hAnsiTheme="minorHAnsi" w:cstheme="minorHAnsi"/>
                 <w:b/>
                 <w:bCs/>
-                <w:sz w:val="22"/>
-                <w:szCs w:val="18"/>
+                <w:sz w:val="20"/>
+                <w:szCs w:val="16"/>
               </w:rPr>
               <w:t>6º</w:t>
             </w:r>
@@ -932,8 +2510,8 @@
                 <w:rFonts w:asciiTheme="minorHAnsi" w:hAnsiTheme="minorHAnsi" w:cstheme="minorHAnsi"/>
                 <w:b/>
                 <w:bCs/>
-                <w:sz w:val="22"/>
-                <w:szCs w:val="18"/>
+                <w:sz w:val="20"/>
+                <w:szCs w:val="16"/>
               </w:rPr>
             </w:pPr>
             <w:r>
@@ -941,8 +2519,8 @@
                 <w:rFonts w:asciiTheme="minorHAnsi" w:hAnsiTheme="minorHAnsi" w:cstheme="minorHAnsi"/>
                 <w:b/>
                 <w:bCs/>
-                <w:sz w:val="22"/>
-                <w:szCs w:val="18"/>
+                <w:sz w:val="20"/>
+                <w:szCs w:val="16"/>
               </w:rPr>
               <w:t>7º</w:t>
             </w:r>
@@ -961,8 +2539,8 @@
                 <w:rFonts w:asciiTheme="minorHAnsi" w:hAnsiTheme="minorHAnsi" w:cstheme="minorHAnsi"/>
                 <w:b/>
                 <w:bCs/>
-                <w:sz w:val="22"/>
-                <w:szCs w:val="18"/>
+                <w:sz w:val="20"/>
+                <w:szCs w:val="16"/>
               </w:rPr>
             </w:pPr>
             <w:r>
@@ -970,8 +2548,8 @@
                 <w:rFonts w:asciiTheme="minorHAnsi" w:hAnsiTheme="minorHAnsi" w:cstheme="minorHAnsi"/>
                 <w:b/>
                 <w:bCs/>
-                <w:sz w:val="22"/>
-                <w:szCs w:val="18"/>
+                <w:sz w:val="20"/>
+                <w:szCs w:val="16"/>
               </w:rPr>
               <w:t>8º</w:t>
             </w:r>
@@ -991,8 +2569,8 @@
                 <w:rFonts w:asciiTheme="minorHAnsi" w:hAnsiTheme="minorHAnsi" w:cstheme="minorHAnsi"/>
                 <w:b/>
                 <w:bCs/>
-                <w:sz w:val="22"/>
-                <w:szCs w:val="18"/>
+                <w:sz w:val="20"/>
+                <w:szCs w:val="16"/>
               </w:rPr>
             </w:pPr>
             <w:r>
@@ -1000,8 +2578,8 @@
                 <w:rFonts w:asciiTheme="minorHAnsi" w:hAnsiTheme="minorHAnsi" w:cstheme="minorHAnsi"/>
                 <w:b/>
                 <w:bCs/>
-                <w:sz w:val="22"/>
-                <w:szCs w:val="18"/>
+                <w:sz w:val="20"/>
+                <w:szCs w:val="16"/>
               </w:rPr>
               <w:t>9º</w:t>
             </w:r>
@@ -1020,8 +2598,8 @@
                 <w:rFonts w:asciiTheme="minorHAnsi" w:hAnsiTheme="minorHAnsi" w:cstheme="minorHAnsi"/>
                 <w:b/>
                 <w:bCs/>
-                <w:sz w:val="22"/>
-                <w:szCs w:val="18"/>
+                <w:sz w:val="20"/>
+                <w:szCs w:val="16"/>
               </w:rPr>
             </w:pPr>
             <w:r>
@@ -1029,8 +2607,8 @@
                 <w:rFonts w:asciiTheme="minorHAnsi" w:hAnsiTheme="minorHAnsi" w:cstheme="minorHAnsi"/>
                 <w:b/>
                 <w:bCs/>
-                <w:sz w:val="22"/>
-                <w:szCs w:val="18"/>
+                <w:sz w:val="20"/>
+                <w:szCs w:val="16"/>
               </w:rPr>
               <w:t>10º</w:t>
             </w:r>
@@ -1054,8 +2632,8 @@
                 <w:rFonts w:asciiTheme="minorHAnsi" w:hAnsiTheme="minorHAnsi" w:cstheme="minorHAnsi"/>
                 <w:b/>
                 <w:bCs/>
-                <w:sz w:val="22"/>
-                <w:szCs w:val="18"/>
+                <w:sz w:val="20"/>
+                <w:szCs w:val="16"/>
               </w:rPr>
             </w:pPr>
             <w:r>
@@ -1063,8 +2641,8 @@
                 <w:rFonts w:asciiTheme="minorHAnsi" w:hAnsiTheme="minorHAnsi" w:cstheme="minorHAnsi"/>
                 <w:b/>
                 <w:bCs/>
-                <w:sz w:val="22"/>
-                <w:szCs w:val="18"/>
+                <w:sz w:val="20"/>
+                <w:szCs w:val="16"/>
               </w:rPr>
               <w:t>VALOR</w:t>
             </w:r>
@@ -1081,15 +2659,15 @@
               <w:jc w:val="center"/>
               <w:rPr>
                 <w:rFonts w:asciiTheme="minorHAnsi" w:hAnsiTheme="minorHAnsi" w:cstheme="minorHAnsi"/>
-                <w:sz w:val="22"/>
-                <w:szCs w:val="18"/>
+                <w:sz w:val="20"/>
+                <w:szCs w:val="16"/>
               </w:rPr>
             </w:pPr>
             <w:r>
               <w:rPr>
                 <w:rFonts w:asciiTheme="minorHAnsi" w:hAnsiTheme="minorHAnsi" w:cstheme="minorHAnsi"/>
-                <w:sz w:val="22"/>
-                <w:szCs w:val="18"/>
+                <w:sz w:val="20"/>
+                <w:szCs w:val="16"/>
               </w:rPr>
               <w:t>[[b1]]</w:t>
             </w:r>
@@ -1105,15 +2683,15 @@
               <w:jc w:val="center"/>
               <w:rPr>
                 <w:rFonts w:asciiTheme="minorHAnsi" w:hAnsiTheme="minorHAnsi" w:cstheme="minorHAnsi"/>
-                <w:sz w:val="22"/>
-                <w:szCs w:val="18"/>
+                <w:sz w:val="20"/>
+                <w:szCs w:val="16"/>
               </w:rPr>
             </w:pPr>
             <w:r>
               <w:rPr>
                 <w:rFonts w:asciiTheme="minorHAnsi" w:hAnsiTheme="minorHAnsi" w:cstheme="minorHAnsi"/>
-                <w:sz w:val="22"/>
-                <w:szCs w:val="18"/>
+                <w:sz w:val="20"/>
+                <w:szCs w:val="16"/>
               </w:rPr>
               <w:t>[[b2]]</w:t>
             </w:r>
@@ -1130,15 +2708,15 @@
               <w:jc w:val="center"/>
               <w:rPr>
                 <w:rFonts w:asciiTheme="minorHAnsi" w:hAnsiTheme="minorHAnsi" w:cstheme="minorHAnsi"/>
-                <w:sz w:val="22"/>
-                <w:szCs w:val="18"/>
+                <w:sz w:val="20"/>
+                <w:szCs w:val="16"/>
               </w:rPr>
             </w:pPr>
             <w:r>
               <w:rPr>
                 <w:rFonts w:asciiTheme="minorHAnsi" w:hAnsiTheme="minorHAnsi" w:cstheme="minorHAnsi"/>
-                <w:sz w:val="22"/>
-                <w:szCs w:val="18"/>
+                <w:sz w:val="20"/>
+                <w:szCs w:val="16"/>
               </w:rPr>
               <w:t>[[b3]]</w:t>
             </w:r>
@@ -1154,15 +2732,15 @@
               <w:jc w:val="center"/>
               <w:rPr>
                 <w:rFonts w:asciiTheme="minorHAnsi" w:hAnsiTheme="minorHAnsi" w:cstheme="minorHAnsi"/>
-                <w:sz w:val="22"/>
-                <w:szCs w:val="18"/>
+                <w:sz w:val="20"/>
+                <w:szCs w:val="16"/>
               </w:rPr>
             </w:pPr>
             <w:r>
               <w:rPr>
                 <w:rFonts w:asciiTheme="minorHAnsi" w:hAnsiTheme="minorHAnsi" w:cstheme="minorHAnsi"/>
-                <w:sz w:val="22"/>
-                <w:szCs w:val="18"/>
+                <w:sz w:val="20"/>
+                <w:szCs w:val="16"/>
               </w:rPr>
               <w:t>[[b4]]</w:t>
             </w:r>
@@ -1179,15 +2757,15 @@
               <w:jc w:val="center"/>
               <w:rPr>
                 <w:rFonts w:asciiTheme="minorHAnsi" w:hAnsiTheme="minorHAnsi" w:cstheme="minorHAnsi"/>
-                <w:sz w:val="22"/>
-                <w:szCs w:val="18"/>
+                <w:sz w:val="20"/>
+                <w:szCs w:val="16"/>
               </w:rPr>
             </w:pPr>
             <w:r>
               <w:rPr>
                 <w:rFonts w:asciiTheme="minorHAnsi" w:hAnsiTheme="minorHAnsi" w:cstheme="minorHAnsi"/>
-                <w:sz w:val="22"/>
-                <w:szCs w:val="18"/>
+                <w:sz w:val="20"/>
+                <w:szCs w:val="16"/>
               </w:rPr>
               <w:t>[[b5]]</w:t>
             </w:r>
@@ -1204,15 +2782,15 @@
               <w:jc w:val="center"/>
               <w:rPr>
                 <w:rFonts w:asciiTheme="minorHAnsi" w:hAnsiTheme="minorHAnsi" w:cstheme="minorHAnsi"/>
-                <w:sz w:val="22"/>
-                <w:szCs w:val="18"/>
+                <w:sz w:val="20"/>
+                <w:szCs w:val="16"/>
               </w:rPr>
             </w:pPr>
             <w:r>
               <w:rPr>
                 <w:rFonts w:asciiTheme="minorHAnsi" w:hAnsiTheme="minorHAnsi" w:cstheme="minorHAnsi"/>
-                <w:sz w:val="22"/>
-                <w:szCs w:val="18"/>
+                <w:sz w:val="20"/>
+                <w:szCs w:val="16"/>
               </w:rPr>
               <w:t>[[b6]]</w:t>
             </w:r>
@@ -1229,15 +2807,15 @@
               <w:jc w:val="center"/>
               <w:rPr>
                 <w:rFonts w:asciiTheme="minorHAnsi" w:hAnsiTheme="minorHAnsi" w:cstheme="minorHAnsi"/>
-                <w:sz w:val="22"/>
-                <w:szCs w:val="18"/>
+                <w:sz w:val="20"/>
+                <w:szCs w:val="16"/>
               </w:rPr>
             </w:pPr>
             <w:r>
               <w:rPr>
                 <w:rFonts w:asciiTheme="minorHAnsi" w:hAnsiTheme="minorHAnsi" w:cstheme="minorHAnsi"/>
-                <w:sz w:val="22"/>
-                <w:szCs w:val="18"/>
+                <w:sz w:val="20"/>
+                <w:szCs w:val="16"/>
               </w:rPr>
               <w:t>[[b7]]</w:t>
             </w:r>
@@ -1254,15 +2832,15 @@
               <w:jc w:val="center"/>
               <w:rPr>
                 <w:rFonts w:asciiTheme="minorHAnsi" w:hAnsiTheme="minorHAnsi" w:cstheme="minorHAnsi"/>
-                <w:sz w:val="22"/>
-                <w:szCs w:val="18"/>
+                <w:sz w:val="20"/>
+                <w:szCs w:val="16"/>
               </w:rPr>
             </w:pPr>
             <w:r>
               <w:rPr>
                 <w:rFonts w:asciiTheme="minorHAnsi" w:hAnsiTheme="minorHAnsi" w:cstheme="minorHAnsi"/>
-                <w:sz w:val="22"/>
-                <w:szCs w:val="18"/>
+                <w:sz w:val="20"/>
+                <w:szCs w:val="16"/>
               </w:rPr>
               <w:t>[[b8]]</w:t>
             </w:r>
@@ -1280,15 +2858,15 @@
               <w:jc w:val="center"/>
               <w:rPr>
                 <w:rFonts w:asciiTheme="minorHAnsi" w:hAnsiTheme="minorHAnsi" w:cstheme="minorHAnsi"/>
-                <w:sz w:val="22"/>
-                <w:szCs w:val="18"/>
+                <w:sz w:val="20"/>
+                <w:szCs w:val="16"/>
               </w:rPr>
             </w:pPr>
             <w:r>
               <w:rPr>
                 <w:rFonts w:asciiTheme="minorHAnsi" w:hAnsiTheme="minorHAnsi" w:cstheme="minorHAnsi"/>
-                <w:sz w:val="22"/>
-                <w:szCs w:val="18"/>
+                <w:sz w:val="20"/>
+                <w:szCs w:val="16"/>
               </w:rPr>
               <w:t>[[b9]]</w:t>
             </w:r>
@@ -1305,15 +2883,15 @@
               <w:jc w:val="center"/>
               <w:rPr>
                 <w:rFonts w:asciiTheme="minorHAnsi" w:hAnsiTheme="minorHAnsi" w:cstheme="minorHAnsi"/>
-                <w:sz w:val="22"/>
-                <w:szCs w:val="18"/>
+                <w:sz w:val="20"/>
+                <w:szCs w:val="16"/>
               </w:rPr>
             </w:pPr>
             <w:r>
               <w:rPr>
                 <w:rFonts w:asciiTheme="minorHAnsi" w:hAnsiTheme="minorHAnsi" w:cstheme="minorHAnsi"/>
-                <w:sz w:val="22"/>
-                <w:szCs w:val="18"/>
+                <w:sz w:val="20"/>
+                <w:szCs w:val="16"/>
               </w:rPr>
               <w:t>[[b10]]</w:t>
             </w:r>
@@ -1338,8 +2916,8 @@
                 <w:rFonts w:asciiTheme="minorHAnsi" w:hAnsiTheme="minorHAnsi" w:cstheme="minorHAnsi"/>
                 <w:b/>
                 <w:bCs/>
-                <w:sz w:val="22"/>
-                <w:szCs w:val="18"/>
+                <w:sz w:val="20"/>
+                <w:szCs w:val="16"/>
               </w:rPr>
             </w:pPr>
             <w:r>
@@ -1347,8 +2925,8 @@
                 <w:rFonts w:asciiTheme="minorHAnsi" w:hAnsiTheme="minorHAnsi" w:cstheme="minorHAnsi"/>
                 <w:b/>
                 <w:bCs/>
-                <w:sz w:val="22"/>
-                <w:szCs w:val="18"/>
+                <w:sz w:val="20"/>
+                <w:szCs w:val="16"/>
               </w:rPr>
               <w:t>MÉDIA:</w:t>
             </w:r>
@@ -1367,8 +2945,8 @@
                 <w:rFonts w:asciiTheme="minorHAnsi" w:hAnsiTheme="minorHAnsi" w:cstheme="minorHAnsi"/>
                 <w:b/>
                 <w:bCs/>
-                <w:sz w:val="22"/>
-                <w:szCs w:val="18"/>
+                <w:sz w:val="20"/>
+                <w:szCs w:val="16"/>
               </w:rPr>
             </w:pPr>
             <w:r>
@@ -1376,8 +2954,8 @@
                 <w:rFonts w:asciiTheme="minorHAnsi" w:hAnsiTheme="minorHAnsi" w:cstheme="minorHAnsi"/>
                 <w:b/>
                 <w:bCs/>
-                <w:sz w:val="22"/>
-                <w:szCs w:val="18"/>
+                <w:sz w:val="20"/>
+                <w:szCs w:val="16"/>
               </w:rPr>
               <w:t>[[media]]</w:t>
             </w:r>
@@ -1396,8 +2974,8 @@
                 <w:rFonts w:asciiTheme="minorHAnsi" w:hAnsiTheme="minorHAnsi" w:cstheme="minorHAnsi"/>
                 <w:b/>
                 <w:bCs/>
-                <w:sz w:val="22"/>
-                <w:szCs w:val="18"/>
+                <w:sz w:val="20"/>
+                <w:szCs w:val="16"/>
               </w:rPr>
             </w:pPr>
             <w:r>
@@ -1405,8 +2983,8 @@
                 <w:rFonts w:asciiTheme="minorHAnsi" w:hAnsiTheme="minorHAnsi" w:cstheme="minorHAnsi"/>
                 <w:b/>
                 <w:bCs/>
-                <w:sz w:val="22"/>
-                <w:szCs w:val="18"/>
+                <w:sz w:val="20"/>
+                <w:szCs w:val="16"/>
               </w:rPr>
               <w:t>COEFICIENTE DE CORREÇÃO DO ÍNDICE ESCLEROMÉTRICO:</w:t>
             </w:r>
@@ -1426,8 +3004,8 @@
                 <w:rFonts w:asciiTheme="minorHAnsi" w:hAnsiTheme="minorHAnsi" w:cstheme="minorHAnsi"/>
                 <w:b/>
                 <w:bCs/>
-                <w:sz w:val="22"/>
-                <w:szCs w:val="18"/>
+                <w:sz w:val="20"/>
+                <w:szCs w:val="16"/>
               </w:rPr>
             </w:pPr>
             <w:r>
@@ -1435,8 +3013,8 @@
                 <w:rFonts w:asciiTheme="minorHAnsi" w:hAnsiTheme="minorHAnsi" w:cstheme="minorHAnsi"/>
                 <w:b/>
                 <w:bCs/>
-                <w:sz w:val="22"/>
-                <w:szCs w:val="18"/>
+                <w:sz w:val="20"/>
+                <w:szCs w:val="16"/>
               </w:rPr>
               <w:t>[[coef]]</w:t>
             </w:r>
@@ -1457,12 +3035,14 @@
           <w:rFonts w:asciiTheme="minorHAnsi" w:hAnsiTheme="minorHAnsi"/>
         </w:rPr>
       </w:pPr>
+      <w:bookmarkStart w:id="9" w:name="_Toc229498017"/>
       <w:r>
         <w:rPr>
           <w:rFonts w:asciiTheme="minorHAnsi" w:hAnsiTheme="minorHAnsi"/>
         </w:rPr>
         <w:t>POSIÇÕES DE APLICAÇÃO DO EQUIPAMENTO</w:t>
       </w:r>
+      <w:bookmarkEnd w:id="9"/>
     </w:p>
     <w:p>
       <w:pPr>
@@ -1493,7 +3073,7 @@
                     </pic:cNvPicPr>
                   </pic:nvPicPr>
                   <pic:blipFill>
-                    <a:blip r:embed="rId10">
+                    <a:blip r:embed="rId12">
                       <a:extLst>
                         <a:ext uri="{28A0092B-C50C-407E-A947-70E740481C1C}">
                           <a14:useLocalDpi xmlns:a14="http://schemas.microsoft.com/office/drawing/2010/main" val="0"/>
@@ -1560,7 +3140,7 @@
           <w:rFonts w:asciiTheme="minorHAnsi" w:hAnsiTheme="minorHAnsi" w:cstheme="minorHAnsi"/>
           <w:noProof/>
         </w:rPr>
-        <w:t>1</w:t>
+        <w:t>6</w:t>
       </w:r>
       <w:r>
         <w:rPr>
@@ -1601,6 +3181,7 @@
           <w:rFonts w:asciiTheme="minorHAnsi" w:hAnsiTheme="minorHAnsi"/>
         </w:rPr>
       </w:pPr>
+      <w:bookmarkStart w:id="10" w:name="_Toc229498018"/>
       <w:r>
         <w:rPr>
           <w:rFonts w:asciiTheme="minorHAnsi" w:hAnsiTheme="minorHAnsi"/>
@@ -1608,6 +3189,7 @@
         <w:lastRenderedPageBreak/>
         <w:t>RESULTADOS DE ENSAIO</w:t>
       </w:r>
+      <w:bookmarkEnd w:id="10"/>
     </w:p>
     <w:tbl>
       <w:tblPr>
@@ -2012,7 +3594,7 @@
           <w:rFonts w:asciiTheme="minorHAnsi" w:hAnsiTheme="minorHAnsi" w:cstheme="minorHAnsi"/>
           <w:lang w:eastAsia="pt-BR"/>
         </w:rPr>
-        <w:t>[[#notas]]</w:t>
+        <w:t>[[#fotos_memorial]]</w:t>
       </w:r>
     </w:p>
     <w:p>
@@ -2032,8 +3614,126 @@
         <w:rPr>
           <w:rFonts w:asciiTheme="minorHAnsi" w:hAnsiTheme="minorHAnsi"/>
         </w:rPr>
+        <w:t>MEMORIAL FOTOGRÁFICO</w:t>
+      </w:r>
+    </w:p>
+    <w:tbl>
+      <w:tblPr>
+        <w:tblStyle w:val="Tabelacomgrade"/>
+        <w:tblW w:w="0" w:type="auto"/>
+        <w:tblLook w:val="04A0" w:firstRow="1" w:lastRow="0" w:firstColumn="1" w:lastColumn="0" w:noHBand="0" w:noVBand="1"/>
+      </w:tblPr>
+      <w:tblGrid>
+        <w:gridCol w:w="5027"/>
+        <w:gridCol w:w="5027"/>
+      </w:tblGrid>
+      <w:tr>
+        <w:tc>
+          <w:tcPr>
+            <w:tcW w:w="5027" w:type="dxa"/>
+            <w:vAlign w:val="center"/>
+          </w:tcPr>
+          <w:p>
+            <w:pPr>
+              <w:jc w:val="center"/>
+              <w:rPr>
+                <w:rFonts w:asciiTheme="minorHAnsi" w:hAnsiTheme="minorHAnsi" w:cstheme="minorHAnsi"/>
+                <w:lang w:eastAsia="pt-BR"/>
+              </w:rPr>
+            </w:pPr>
+            <w:r>
+              <w:rPr>
+                <w:rFonts w:asciiTheme="minorHAnsi" w:hAnsiTheme="minorHAnsi" w:cstheme="minorHAnsi"/>
+                <w:lang w:eastAsia="pt-BR"/>
+              </w:rPr>
+              <w:t>MEMORIAL_PLACEHOLDER</w:t>
+            </w:r>
+          </w:p>
+        </w:tc>
+        <w:tc>
+          <w:tcPr>
+            <w:tcW w:w="5027" w:type="dxa"/>
+            <w:vAlign w:val="center"/>
+          </w:tcPr>
+          <w:p>
+            <w:pPr>
+              <w:jc w:val="center"/>
+              <w:rPr>
+                <w:rFonts w:asciiTheme="minorHAnsi" w:hAnsiTheme="minorHAnsi" w:cstheme="minorHAnsi"/>
+                <w:lang w:eastAsia="pt-BR"/>
+              </w:rPr>
+            </w:pPr>
+          </w:p>
+        </w:tc>
+      </w:tr>
+    </w:tbl>
+    <w:p>
+      <w:pPr>
+        <w:rPr>
+          <w:rFonts w:asciiTheme="minorHAnsi" w:hAnsiTheme="minorHAnsi" w:cstheme="minorHAnsi"/>
+          <w:lang w:eastAsia="pt-BR"/>
+        </w:rPr>
+      </w:pPr>
+    </w:p>
+    <w:p>
+      <w:pPr>
+        <w:rPr>
+          <w:rFonts w:asciiTheme="minorHAnsi" w:hAnsiTheme="minorHAnsi" w:cstheme="minorHAnsi"/>
+          <w:lang w:eastAsia="pt-BR"/>
+        </w:rPr>
+      </w:pPr>
+      <w:r>
+        <w:rPr>
+          <w:rFonts w:asciiTheme="minorHAnsi" w:hAnsiTheme="minorHAnsi" w:cstheme="minorHAnsi"/>
+          <w:lang w:eastAsia="pt-BR"/>
+        </w:rPr>
+        <w:t>[[/fotos_memorial]]</w:t>
+      </w:r>
+    </w:p>
+    <w:p>
+      <w:pPr>
+        <w:rPr>
+          <w:rFonts w:asciiTheme="minorHAnsi" w:hAnsiTheme="minorHAnsi" w:cstheme="minorHAnsi"/>
+          <w:lang w:eastAsia="pt-BR"/>
+        </w:rPr>
+      </w:pPr>
+    </w:p>
+    <w:p>
+      <w:pPr>
+        <w:rPr>
+          <w:rFonts w:asciiTheme="minorHAnsi" w:hAnsiTheme="minorHAnsi" w:cstheme="minorHAnsi"/>
+          <w:lang w:eastAsia="pt-BR"/>
+        </w:rPr>
+      </w:pPr>
+      <w:r>
+        <w:rPr>
+          <w:rFonts w:asciiTheme="minorHAnsi" w:hAnsiTheme="minorHAnsi" w:cstheme="minorHAnsi"/>
+          <w:lang w:eastAsia="pt-BR"/>
+        </w:rPr>
+        <w:t>[[#notas]]</w:t>
+      </w:r>
+    </w:p>
+    <w:p>
+      <w:pPr>
+        <w:pStyle w:val="Ttulo1"/>
+        <w:numPr>
+          <w:ilvl w:val="0"/>
+          <w:numId w:val="1"/>
+        </w:numPr>
+        <w:spacing w:before="240" w:after="240" w:line="360" w:lineRule="auto"/>
+        <w:jc w:val="both"/>
+        <w:rPr>
+          <w:rFonts w:asciiTheme="minorHAnsi" w:hAnsiTheme="minorHAnsi"/>
+        </w:rPr>
+      </w:pPr>
+      <w:bookmarkStart w:id="11" w:name="_Toc229498019"/>
+      <w:r>
+        <w:rPr>
+          <w:rFonts w:asciiTheme="minorHAnsi" w:hAnsiTheme="minorHAnsi"/>
+        </w:rPr>
         <w:t>NOTAS</w:t>
       </w:r>
+      <w:bookmarkEnd w:id="11"/>
     </w:p>
     <w:p>
       <w:pPr>
@@ -2105,7 +3805,7 @@
                     </pic:cNvPicPr>
                   </pic:nvPicPr>
                   <pic:blipFill>
-                    <a:blip r:embed="rId11">
+                    <a:blip r:embed="rId13">
                       <a:extLst>
                         <a:ext uri="{28A0092B-C50C-407E-A947-70E740481C1C}">
                           <a14:useLocalDpi xmlns:a14="http://schemas.microsoft.com/office/drawing/2010/main" val="0"/>
@@ -2285,8 +3985,8 @@
       </w:pPr>
     </w:p>
     <w:sectPr>
-      <w:headerReference w:type="default" r:id="rId12"/>
-      <w:footerReference w:type="default" r:id="rId13"/>
+      <w:headerReference w:type="default" r:id="rId14"/>
+      <w:footerReference w:type="default" r:id="rId15"/>
       <w:pgSz w:w="11907" w:h="16840" w:code="9"/>
       <w:pgMar w:top="1134" w:right="992" w:bottom="1134" w:left="851" w:header="284" w:footer="227" w:gutter="0"/>
       <w:paperSrc w:first="7" w:other="7"/>
@@ -7794,7 +9494,7 @@
   <w:style w:type="paragraph" w:default="1" w:styleId="Normal">
     <w:name w:val="Normal"/>
     <w:qFormat/>
-    <w:rsid w:val="00FD7C04"/>
+    <w:rsid w:val="004C081B"/>
     <w:rPr>
       <w:sz w:val="24"/>
       <w:szCs w:val="20"/>
@@ -7883,6 +9583,7 @@
   <w:style w:type="character" w:default="1" w:styleId="Fontepargpadro">
     <w:name w:val="Default Paragraph Font"/>
     <w:uiPriority w:val="1"/>
+    <w:semiHidden/>
     <w:unhideWhenUsed/>
   </w:style>
   <w:style w:type="table" w:default="1" w:styleId="Tabelanormal">

</xml_diff>